<commit_message>
Complete Q4 with alignment for substitution penalty
</commit_message>
<xml_diff>
--- a/Q4_sequence_alignment.docx
+++ b/Q4_sequence_alignment.docx
@@ -1,6 +1,6 @@
 
 <file path=word/document2.xml><?xml version="1.0" encoding="utf-8"?>
-<w:document xmlns:wpc="http://schemas.microsoft.com/office/word/2010/wordprocessingCanvas" xmlns:mc="http://schemas.openxmlformats.org/markup-compatibility/2006" xmlns:o="urn:schemas-microsoft-com:office:office" xmlns:r="http://schemas.openxmlformats.org/officeDocument/2006/relationships" xmlns:m="http://schemas.openxmlformats.org/officeDocument/2006/math" xmlns:v="urn:schemas-microsoft-com:vml" xmlns:wp14="http://schemas.microsoft.com/office/word/2010/wordprocessingDrawing" xmlns:wp="http://schemas.openxmlformats.org/drawingml/2006/wordprocessingDrawing" xmlns:w10="urn:schemas-microsoft-com:office:word" xmlns:w="http://schemas.openxmlformats.org/wordprocessingml/2006/main" xmlns:w14="http://schemas.microsoft.com/office/word/2010/wordml" xmlns:w15="http://schemas.microsoft.com/office/word/2012/wordml" xmlns:wpg="http://schemas.microsoft.com/office/word/2010/wordprocessingGroup" xmlns:wpi="http://schemas.microsoft.com/office/word/2010/wordprocessingInk" xmlns:wne="http://schemas.microsoft.com/office/word/2006/wordml" xmlns:wps="http://schemas.microsoft.com/office/word/2010/wordprocessingShape" xmlns:w16se="http://schemas.microsoft.com/office/word/2015/wordml/symex" xmlns:w16cid="http://schemas.microsoft.com/office/word/2016/wordml/cid" xmlns:w16="http://schemas.microsoft.com/office/word/2018/wordml" xmlns:w16cex="http://schemas.microsoft.com/office/word/2018/wordml/cex" xmlns:w16sdtdh="http://schemas.microsoft.com/office/word/2020/wordml/sdtdatahash" xmlns:w16sdtfl="http://schemas.microsoft.com/office/word/2024/wordml/sdtformatlock" mc:Ignorable="w14 w15 wp14 w16se w16cid w16 w16cex w16sdtdh w16sdtfl">
+<w:document xmlns:wpc="http://schemas.microsoft.com/office/word/2010/wordprocessingCanvas" xmlns:mc="http://schemas.openxmlformats.org/markup-compatibility/2006" xmlns:o="urn:schemas-microsoft-com:office:office" xmlns:r="http://schemas.openxmlformats.org/officeDocument/2006/relationships" xmlns:m="http://schemas.openxmlformats.org/officeDocument/2006/math" xmlns:v="urn:schemas-microsoft-com:vml" xmlns:wp14="http://schemas.microsoft.com/office/word/2010/wordprocessingDrawing" xmlns:wp="http://schemas.openxmlformats.org/drawingml/2006/wordprocessingDrawing" xmlns:w10="urn:schemas-microsoft-com:office:word" xmlns:w="http://schemas.openxmlformats.org/wordprocessingml/2006/main" xmlns:w14="http://schemas.microsoft.com/office/word/2010/wordml" xmlns:w15="http://schemas.microsoft.com/office/word/2012/wordml" xmlns:wpg="http://schemas.microsoft.com/office/word/2010/wordprocessingGroup" xmlns:wpi="http://schemas.microsoft.com/office/word/2010/wordprocessingInk" xmlns:wne="http://schemas.microsoft.com/office/word/2006/wordml" xmlns:wps="http://schemas.microsoft.com/office/word/2010/wordprocessingShape" xmlns:w16se="http://schemas.microsoft.com/office/word/2015/wordml/symex" xmlns:w16cid="http://schemas.microsoft.com/office/word/2016/wordml/cid" xmlns:w16="http://schemas.microsoft.com/office/word/2018/wordml" xmlns:w16cex="http://schemas.microsoft.com/office/word/2018/wordml/cex" xmlns:w16sdtdh="http://schemas.microsoft.com/office/word/2020/wordml/sdtdatahash" xmlns:w16sdtfl="http://schemas.microsoft.com/office/word/2024/wordml/sdtformatlock" xmlns:a="http://schemas.openxmlformats.org/drawingml/2006/main" xmlns:pic="http://schemas.openxmlformats.org/drawingml/2006/picture" xmlns:a14="http://schemas.microsoft.com/office/drawing/2010/main" mc:Ignorable="w14 w15 wp14 w16se w16cid w16 w16cex w16sdtdh w16sdtfl">
   <w:body>
     <w:p>
       <w:pPr>
@@ -231,6 +231,13 @@
         <w:bidi w:val="0"/>
         <w:ind w:left="-115"/>
         <w:jc w:val="left"/>
+        <w:rPr>
+          <w:rFonts w:ascii="Aptos" w:hAnsi="Aptos" w:eastAsia="Aptos" w:cs="Aptos"/>
+          <w:noProof w:val="0"/>
+          <w:sz w:val="20"/>
+          <w:szCs w:val="20"/>
+          <w:lang w:val="en-GB"/>
+        </w:rPr>
       </w:pPr>
       <w:r>
         <w:rPr>
@@ -241,6 +248,44 @@
           <w:lang w:val="en-GB"/>
         </w:rPr>
         <w:t>Please provide the alignment matrix, the traceback and the string alignment using the scoring present in Unit 6.1.</w:t>
+      </w:r>
+    </w:p>
+    <w:p>
+      <w:pPr>
+        <w:pStyle w:val="Header"/>
+        <w:bidi w:val="0"/>
+        <w:ind w:left="-115"/>
+        <w:jc w:val="left"/>
+        <w:rPr>
+          <w:rFonts w:ascii="Aptos" w:hAnsi="Aptos" w:eastAsia="Aptos" w:cs="Aptos"/>
+          <w:noProof w:val="0"/>
+          <w:sz w:val="20"/>
+          <w:szCs w:val="20"/>
+          <w:lang w:val="en-GB"/>
+        </w:rPr>
+      </w:pPr>
+    </w:p>
+    <w:p>
+      <w:pPr>
+        <w:pStyle w:val="Header"/>
+        <w:bidi w:val="0"/>
+        <w:ind w:left="-115"/>
+        <w:jc w:val="left"/>
+        <w:rPr>
+          <w:noProof w:val="0"/>
+          <w:sz w:val="20"/>
+          <w:szCs w:val="20"/>
+          <w:lang w:val="en-GB"/>
+        </w:rPr>
+      </w:pPr>
+      <w:r>
+        <w:rPr>
+          <w:noProof w:val="0"/>
+          <w:sz w:val="20"/>
+          <w:szCs w:val="20"/>
+          <w:lang w:val="en-GB"/>
+        </w:rPr>
+        <w:t>What would happen if the penalty for a substitution is bigger than the penalty for a gap? Would that change the optimal string alignment? If so, what would it be? Please give only the new string alignment.</w:t>
       </w:r>
     </w:p>
     <w:p>
@@ -418,7 +463,22 @@
         <w:bidi w:val="0"/>
         <w:ind w:left="-115"/>
         <w:jc w:val="left"/>
+        <w:rPr>
+          <w:rFonts w:ascii="Aptos" w:hAnsi="Aptos" w:eastAsia="Aptos" w:cs="Aptos"/>
+          <w:noProof w:val="0"/>
+          <w:sz w:val="20"/>
+          <w:szCs w:val="20"/>
+          <w:lang w:val="en-GB"/>
+        </w:rPr>
       </w:pPr>
+    </w:p>
+    <w:p>
+      <w:pPr>
+        <w:pStyle w:val="Header"/>
+        <w:bidi w:val="0"/>
+        <w:ind w:left="-115"/>
+        <w:jc w:val="left"/>
+      </w:pPr>
       <w:r>
         <w:rPr>
           <w:rFonts w:ascii="Aptos" w:hAnsi="Aptos" w:eastAsia="Aptos" w:cs="Aptos"/>
@@ -448,6 +508,59 @@
           <w:lang w:val="en-GB"/>
         </w:rPr>
         <w:t xml:space="preserve"> using dynamic programming where each cell uses scores already calculated in nearby cells and then I choose the highest score.</w:t>
+      </w:r>
+    </w:p>
+    <w:p>
+      <w:pPr>
+        <w:pStyle w:val="Header"/>
+        <w:bidi w:val="0"/>
+        <w:ind w:left="-115"/>
+        <w:jc w:val="left"/>
+        <w:rPr>
+          <w:rFonts w:ascii="Aptos" w:hAnsi="Aptos" w:eastAsia="Aptos" w:cs="Aptos"/>
+          <w:noProof w:val="0"/>
+          <w:sz w:val="20"/>
+          <w:szCs w:val="20"/>
+          <w:lang w:val="en-GB"/>
+        </w:rPr>
+      </w:pPr>
+    </w:p>
+    <w:p>
+      <w:pPr>
+        <w:pStyle w:val="Header"/>
+        <w:bidi w:val="0"/>
+        <w:ind w:left="-115"/>
+        <w:jc w:val="left"/>
+        <w:rPr>
+          <w:rFonts w:ascii="Aptos" w:hAnsi="Aptos" w:eastAsia="Aptos" w:cs="Aptos"/>
+          <w:noProof w:val="0"/>
+          <w:sz w:val="20"/>
+          <w:szCs w:val="20"/>
+          <w:lang w:val="en-GB"/>
+        </w:rPr>
+      </w:pPr>
+    </w:p>
+    <w:p>
+      <w:pPr>
+        <w:pStyle w:val="Header"/>
+        <w:bidi w:val="0"/>
+        <w:ind w:left="-115"/>
+        <w:jc w:val="left"/>
+        <w:rPr>
+          <w:noProof w:val="0"/>
+          <w:u w:val="single"/>
+          <w:lang w:val="en-GB"/>
+        </w:rPr>
+      </w:pPr>
+      <w:r>
+        <w:rPr>
+          <w:b w:val="1"/>
+          <w:bCs w:val="1"/>
+          <w:noProof w:val="0"/>
+          <w:u w:val="single"/>
+          <w:lang w:val="en-GB"/>
+        </w:rPr>
+        <w:t>Alignment matrix</w:t>
       </w:r>
     </w:p>
     <w:p>
@@ -3232,471 +3345,50 @@
     <w:p>
       <w:pPr>
         <w:pStyle w:val="Normal"/>
-        <w:rPr>
-          <w:rFonts w:ascii="Aptos" w:hAnsi="Aptos" w:eastAsia="Aptos" w:cs="Aptos"/>
-          <w:noProof w:val="0"/>
-          <w:sz w:val="20"/>
-          <w:szCs w:val="20"/>
-          <w:lang w:val="en-GB"/>
-        </w:rPr>
+        <w:jc w:val="center"/>
       </w:pPr>
       <w:r>
-        <w:rPr>
-          <w:rFonts w:ascii="Aptos" w:hAnsi="Aptos" w:eastAsia="Aptos" w:cs="Aptos"/>
-          <w:noProof w:val="0"/>
-          <w:sz w:val="20"/>
-          <w:szCs w:val="20"/>
-          <w:lang w:val="en-GB"/>
-        </w:rPr>
-        <w:t xml:space="preserve">The starting scores decrease by 1 because each step </w:t>
-      </w:r>
-      <w:r>
-        <w:rPr>
-          <w:rFonts w:ascii="Aptos" w:hAnsi="Aptos" w:eastAsia="Aptos" w:cs="Aptos"/>
-          <w:noProof w:val="0"/>
-          <w:sz w:val="20"/>
-          <w:szCs w:val="20"/>
-          <w:lang w:val="en-GB"/>
-        </w:rPr>
-        <w:t>represents</w:t>
-      </w:r>
-      <w:r>
-        <w:rPr>
-          <w:rFonts w:ascii="Aptos" w:hAnsi="Aptos" w:eastAsia="Aptos" w:cs="Aptos"/>
-          <w:noProof w:val="0"/>
-          <w:sz w:val="20"/>
-          <w:szCs w:val="20"/>
-          <w:lang w:val="en-GB"/>
-        </w:rPr>
-        <w:t xml:space="preserve"> adding a </w:t>
-      </w:r>
-      <w:r>
-        <w:rPr>
-          <w:rFonts w:ascii="Aptos" w:hAnsi="Aptos" w:eastAsia="Aptos" w:cs="Aptos"/>
-          <w:noProof w:val="0"/>
-          <w:sz w:val="20"/>
-          <w:szCs w:val="20"/>
-          <w:lang w:val="en-GB"/>
-        </w:rPr>
-        <w:t>gap</w:t>
-      </w:r>
-      <w:r>
-        <w:rPr>
-          <w:rFonts w:ascii="Aptos" w:hAnsi="Aptos" w:eastAsia="Aptos" w:cs="Aptos"/>
-          <w:noProof w:val="0"/>
-          <w:sz w:val="20"/>
-          <w:szCs w:val="20"/>
-          <w:lang w:val="en-GB"/>
-        </w:rPr>
-        <w:t xml:space="preserve"> so </w:t>
-      </w:r>
-      <w:r>
-        <w:rPr>
-          <w:rFonts w:ascii="Aptos" w:hAnsi="Aptos" w:eastAsia="Aptos" w:cs="Aptos"/>
-          <w:noProof w:val="0"/>
-          <w:sz w:val="20"/>
-          <w:szCs w:val="20"/>
-          <w:lang w:val="en-GB"/>
-        </w:rPr>
-        <w:t>I start</w:t>
-      </w:r>
-      <w:r>
-        <w:rPr>
-          <w:rFonts w:ascii="Aptos" w:hAnsi="Aptos" w:eastAsia="Aptos" w:cs="Aptos"/>
-          <w:noProof w:val="0"/>
-          <w:sz w:val="20"/>
-          <w:szCs w:val="20"/>
-          <w:lang w:val="en-GB"/>
-        </w:rPr>
-        <w:t xml:space="preserve"> at the bottom-right cell and work backwards to the 0 in the top-left. The path shows which letters or gaps form the final alignment. </w:t>
-      </w:r>
-    </w:p>
-    <w:p>
-      <w:pPr>
-        <w:pStyle w:val="Normal"/>
-        <w:rPr>
-          <w:rFonts w:ascii="Aptos" w:hAnsi="Aptos" w:eastAsia="Aptos" w:cs="Aptos"/>
-          <w:noProof w:val="0"/>
-          <w:sz w:val="20"/>
-          <w:szCs w:val="20"/>
-          <w:lang w:val="en-GB"/>
-        </w:rPr>
-      </w:pPr>
-      <w:r>
-        <w:rPr>
-          <w:rFonts w:ascii="Aptos" w:hAnsi="Aptos" w:eastAsia="Aptos" w:cs="Aptos"/>
-          <w:noProof w:val="0"/>
-          <w:sz w:val="20"/>
-          <w:szCs w:val="20"/>
-          <w:lang w:val="en-GB"/>
-        </w:rPr>
-        <w:t xml:space="preserve">For </w:t>
-      </w:r>
-      <w:r>
-        <w:rPr>
-          <w:rFonts w:ascii="Aptos" w:hAnsi="Aptos" w:eastAsia="Aptos" w:cs="Aptos"/>
-          <w:noProof w:val="0"/>
-          <w:sz w:val="20"/>
-          <w:szCs w:val="20"/>
-          <w:lang w:val="en-GB"/>
-        </w:rPr>
-        <w:t>reference</w:t>
-      </w:r>
-      <w:r>
-        <w:rPr>
-          <w:rFonts w:ascii="Aptos" w:hAnsi="Aptos" w:eastAsia="Aptos" w:cs="Aptos"/>
-          <w:noProof w:val="0"/>
-          <w:sz w:val="20"/>
-          <w:szCs w:val="20"/>
-          <w:lang w:val="en-GB"/>
-        </w:rPr>
-        <w:t xml:space="preserve"> the starting point is highted as </w:t>
-      </w:r>
-      <w:r>
-        <w:rPr>
-          <w:rFonts w:ascii="Aptos" w:hAnsi="Aptos" w:eastAsia="Aptos" w:cs="Aptos"/>
-          <w:noProof w:val="0"/>
-          <w:sz w:val="20"/>
-          <w:szCs w:val="20"/>
-          <w:highlight w:val="cyan"/>
-          <w:lang w:val="en-GB"/>
-        </w:rPr>
-        <w:t>blue</w:t>
-      </w:r>
-      <w:r>
-        <w:rPr>
-          <w:rFonts w:ascii="Aptos" w:hAnsi="Aptos" w:eastAsia="Aptos" w:cs="Aptos"/>
-          <w:noProof w:val="0"/>
-          <w:sz w:val="20"/>
-          <w:szCs w:val="20"/>
-          <w:highlight w:val="cyan"/>
-          <w:lang w:val="en-GB"/>
-        </w:rPr>
-        <w:t xml:space="preserve"> </w:t>
-      </w:r>
-      <w:r>
-        <w:rPr>
-          <w:rFonts w:ascii="Aptos" w:hAnsi="Aptos" w:eastAsia="Aptos" w:cs="Aptos"/>
-          <w:noProof w:val="0"/>
-          <w:sz w:val="20"/>
-          <w:szCs w:val="20"/>
-          <w:lang w:val="en-GB"/>
-        </w:rPr>
-        <w:t>which is the</w:t>
-      </w:r>
-      <w:r>
-        <w:rPr>
-          <w:rFonts w:ascii="Aptos" w:hAnsi="Aptos" w:eastAsia="Aptos" w:cs="Aptos"/>
-          <w:noProof w:val="0"/>
-          <w:sz w:val="20"/>
-          <w:szCs w:val="20"/>
-          <w:lang w:val="en-GB"/>
-        </w:rPr>
-        <w:t xml:space="preserve"> b</w:t>
-      </w:r>
-      <w:r>
-        <w:rPr>
-          <w:rFonts w:ascii="Aptos" w:hAnsi="Aptos" w:eastAsia="Aptos" w:cs="Aptos"/>
-          <w:noProof w:val="0"/>
-          <w:sz w:val="20"/>
-          <w:szCs w:val="20"/>
-          <w:lang w:val="en-GB"/>
-        </w:rPr>
-        <w:t>ottom-right cell,</w:t>
-      </w:r>
-      <w:r>
-        <w:rPr>
-          <w:rFonts w:ascii="Aptos" w:hAnsi="Aptos" w:eastAsia="Aptos" w:cs="Aptos"/>
-          <w:noProof w:val="0"/>
-          <w:sz w:val="20"/>
-          <w:szCs w:val="20"/>
-          <w:lang w:val="en-GB"/>
-        </w:rPr>
-        <w:t xml:space="preserve"> with</w:t>
-      </w:r>
-      <w:r>
-        <w:rPr>
-          <w:rFonts w:ascii="Aptos" w:hAnsi="Aptos" w:eastAsia="Aptos" w:cs="Aptos"/>
-          <w:noProof w:val="0"/>
-          <w:sz w:val="20"/>
-          <w:szCs w:val="20"/>
-          <w:lang w:val="en-GB"/>
-        </w:rPr>
-        <w:t xml:space="preserve"> a score of −2</w:t>
-      </w:r>
-      <w:r>
-        <w:rPr>
-          <w:rFonts w:ascii="Aptos" w:hAnsi="Aptos" w:eastAsia="Aptos" w:cs="Aptos"/>
-          <w:noProof w:val="0"/>
-          <w:sz w:val="20"/>
-          <w:szCs w:val="20"/>
-          <w:lang w:val="en-GB"/>
-        </w:rPr>
-        <w:t xml:space="preserve"> and </w:t>
-      </w:r>
-      <w:r>
-        <w:rPr>
-          <w:rFonts w:ascii="Aptos" w:hAnsi="Aptos" w:eastAsia="Aptos" w:cs="Aptos"/>
-          <w:noProof w:val="0"/>
-          <w:sz w:val="20"/>
-          <w:szCs w:val="20"/>
-          <w:lang w:val="en-GB"/>
-        </w:rPr>
-        <w:t>I follow the highlighted cells backwards to 0.</w:t>
-      </w:r>
-    </w:p>
-    <w:p>
-      <w:pPr>
-        <w:pStyle w:val="Normal"/>
-        <w:rPr>
-          <w:rFonts w:ascii="Aptos" w:hAnsi="Aptos" w:eastAsia="Aptos" w:cs="Aptos"/>
-          <w:noProof w:val="0"/>
-          <w:sz w:val="20"/>
-          <w:szCs w:val="20"/>
-          <w:lang w:val="en-GB"/>
-        </w:rPr>
-      </w:pPr>
-      <w:r>
-        <w:rPr>
-          <w:rFonts w:ascii="Aptos" w:hAnsi="Aptos" w:eastAsia="Aptos" w:cs="Aptos"/>
-          <w:noProof w:val="0"/>
-          <w:sz w:val="20"/>
-          <w:szCs w:val="20"/>
-          <w:lang w:val="en-GB"/>
-        </w:rPr>
-        <w:t xml:space="preserve">My moves </w:t>
-      </w:r>
-      <w:r>
-        <w:rPr>
-          <w:rFonts w:ascii="Aptos" w:hAnsi="Aptos" w:eastAsia="Aptos" w:cs="Aptos"/>
-          <w:noProof w:val="0"/>
-          <w:sz w:val="20"/>
-          <w:szCs w:val="20"/>
-          <w:lang w:val="en-GB"/>
-        </w:rPr>
-        <w:t>are</w:t>
-      </w:r>
-      <w:r>
-        <w:rPr>
-          <w:rFonts w:ascii="Aptos" w:hAnsi="Aptos" w:eastAsia="Aptos" w:cs="Aptos"/>
-          <w:noProof w:val="0"/>
-          <w:sz w:val="20"/>
-          <w:szCs w:val="20"/>
-          <w:lang w:val="en-GB"/>
-        </w:rPr>
-        <w:t xml:space="preserve"> up, diagonal, diagonal, up, diagonal, diagonal, diagonal, diagonal, left and left</w:t>
-      </w:r>
-      <w:r>
-        <w:rPr>
-          <w:rFonts w:ascii="Aptos" w:hAnsi="Aptos" w:eastAsia="Aptos" w:cs="Aptos"/>
-          <w:noProof w:val="0"/>
-          <w:sz w:val="20"/>
-          <w:szCs w:val="20"/>
-          <w:lang w:val="en-GB"/>
-        </w:rPr>
-        <w:t xml:space="preserve"> </w:t>
-      </w:r>
-      <w:r>
-        <w:rPr>
-          <w:rFonts w:ascii="Aptos" w:hAnsi="Aptos" w:eastAsia="Aptos" w:cs="Aptos"/>
-          <w:noProof w:val="0"/>
-          <w:sz w:val="20"/>
-          <w:szCs w:val="20"/>
-          <w:lang w:val="en-GB"/>
-        </w:rPr>
-        <w:t>where</w:t>
-      </w:r>
-      <w:r>
-        <w:rPr>
-          <w:rFonts w:ascii="Aptos" w:hAnsi="Aptos" w:eastAsia="Aptos" w:cs="Aptos"/>
-          <w:noProof w:val="0"/>
-          <w:sz w:val="20"/>
-          <w:szCs w:val="20"/>
-          <w:lang w:val="en-GB"/>
-        </w:rPr>
-        <w:t xml:space="preserve"> each</w:t>
-      </w:r>
-      <w:r>
-        <w:rPr>
-          <w:rFonts w:ascii="Aptos" w:hAnsi="Aptos" w:eastAsia="Aptos" w:cs="Aptos"/>
-          <w:noProof w:val="0"/>
-          <w:sz w:val="20"/>
-          <w:szCs w:val="20"/>
-          <w:lang w:val="en-GB"/>
-        </w:rPr>
-        <w:t xml:space="preserve"> move tells me what to align:</w:t>
-      </w:r>
-    </w:p>
-    <w:p>
-      <w:pPr>
-        <w:pStyle w:val="Normal"/>
-        <w:rPr>
-          <w:rFonts w:ascii="Aptos" w:hAnsi="Aptos" w:eastAsia="Aptos" w:cs="Aptos"/>
-          <w:noProof w:val="0"/>
-          <w:sz w:val="20"/>
-          <w:szCs w:val="20"/>
-          <w:lang w:val="en-GB"/>
-        </w:rPr>
-      </w:pPr>
-      <w:r>
-        <w:rPr>
-          <w:rFonts w:ascii="Aptos" w:hAnsi="Aptos" w:eastAsia="Aptos" w:cs="Aptos"/>
-          <w:noProof w:val="0"/>
-          <w:sz w:val="20"/>
-          <w:szCs w:val="20"/>
-          <w:lang w:val="en-GB"/>
-        </w:rPr>
-        <w:t>Moving d</w:t>
-      </w:r>
-      <w:r>
-        <w:rPr>
-          <w:rFonts w:ascii="Aptos" w:hAnsi="Aptos" w:eastAsia="Aptos" w:cs="Aptos"/>
-          <w:noProof w:val="0"/>
-          <w:sz w:val="20"/>
-          <w:szCs w:val="20"/>
-          <w:lang w:val="en-GB"/>
-        </w:rPr>
-        <w:t>iagonal</w:t>
-      </w:r>
-      <w:r>
-        <w:rPr>
-          <w:rFonts w:ascii="Aptos" w:hAnsi="Aptos" w:eastAsia="Aptos" w:cs="Aptos"/>
-          <w:noProof w:val="0"/>
-          <w:sz w:val="20"/>
-          <w:szCs w:val="20"/>
-          <w:lang w:val="en-GB"/>
-        </w:rPr>
-        <w:t xml:space="preserve"> </w:t>
-      </w:r>
-      <w:r>
-        <w:rPr>
-          <w:rFonts w:ascii="Aptos" w:hAnsi="Aptos" w:eastAsia="Aptos" w:cs="Aptos"/>
-          <w:noProof w:val="0"/>
-          <w:sz w:val="20"/>
-          <w:szCs w:val="20"/>
-          <w:lang w:val="en-GB"/>
-        </w:rPr>
-        <w:t>align</w:t>
-      </w:r>
-      <w:r>
-        <w:rPr>
-          <w:rFonts w:ascii="Aptos" w:hAnsi="Aptos" w:eastAsia="Aptos" w:cs="Aptos"/>
-          <w:noProof w:val="0"/>
-          <w:sz w:val="20"/>
-          <w:szCs w:val="20"/>
-          <w:lang w:val="en-GB"/>
-        </w:rPr>
-        <w:t>s</w:t>
-      </w:r>
-      <w:r>
-        <w:rPr>
-          <w:rFonts w:ascii="Aptos" w:hAnsi="Aptos" w:eastAsia="Aptos" w:cs="Aptos"/>
-          <w:noProof w:val="0"/>
-          <w:sz w:val="20"/>
-          <w:szCs w:val="20"/>
-          <w:lang w:val="en-GB"/>
-        </w:rPr>
-        <w:t xml:space="preserve"> two letters</w:t>
-      </w:r>
-      <w:r>
-        <w:rPr>
-          <w:rFonts w:ascii="Aptos" w:hAnsi="Aptos" w:eastAsia="Aptos" w:cs="Aptos"/>
-          <w:noProof w:val="0"/>
-          <w:sz w:val="20"/>
-          <w:szCs w:val="20"/>
-          <w:lang w:val="en-GB"/>
-        </w:rPr>
-        <w:t>, moving up</w:t>
-      </w:r>
-      <w:r>
-        <w:rPr>
-          <w:rFonts w:ascii="Aptos" w:hAnsi="Aptos" w:eastAsia="Aptos" w:cs="Aptos"/>
-          <w:noProof w:val="0"/>
-          <w:sz w:val="20"/>
-          <w:szCs w:val="20"/>
-          <w:lang w:val="en-GB"/>
-        </w:rPr>
-        <w:t xml:space="preserve"> put</w:t>
-      </w:r>
-      <w:r>
-        <w:rPr>
-          <w:rFonts w:ascii="Aptos" w:hAnsi="Aptos" w:eastAsia="Aptos" w:cs="Aptos"/>
-          <w:noProof w:val="0"/>
-          <w:sz w:val="20"/>
-          <w:szCs w:val="20"/>
-          <w:lang w:val="en-GB"/>
-        </w:rPr>
-        <w:t>s</w:t>
-      </w:r>
-      <w:r>
-        <w:rPr>
-          <w:rFonts w:ascii="Aptos" w:hAnsi="Aptos" w:eastAsia="Aptos" w:cs="Aptos"/>
-          <w:noProof w:val="0"/>
-          <w:sz w:val="20"/>
-          <w:szCs w:val="20"/>
-          <w:lang w:val="en-GB"/>
-        </w:rPr>
-        <w:t xml:space="preserve"> a gap in the top sequence</w:t>
-      </w:r>
-      <w:r>
-        <w:rPr>
-          <w:rFonts w:ascii="Aptos" w:hAnsi="Aptos" w:eastAsia="Aptos" w:cs="Aptos"/>
-          <w:noProof w:val="0"/>
-          <w:sz w:val="20"/>
-          <w:szCs w:val="20"/>
-          <w:lang w:val="en-GB"/>
-        </w:rPr>
-        <w:t xml:space="preserve"> and moving l</w:t>
-      </w:r>
-      <w:r>
-        <w:rPr>
-          <w:rFonts w:ascii="Aptos" w:hAnsi="Aptos" w:eastAsia="Aptos" w:cs="Aptos"/>
-          <w:noProof w:val="0"/>
-          <w:sz w:val="20"/>
-          <w:szCs w:val="20"/>
-          <w:lang w:val="en-GB"/>
-        </w:rPr>
-        <w:t>eft</w:t>
-      </w:r>
-      <w:r>
-        <w:rPr>
-          <w:rFonts w:ascii="Aptos" w:hAnsi="Aptos" w:eastAsia="Aptos" w:cs="Aptos"/>
-          <w:noProof w:val="0"/>
-          <w:sz w:val="20"/>
-          <w:szCs w:val="20"/>
-          <w:lang w:val="en-GB"/>
-        </w:rPr>
-        <w:t xml:space="preserve"> pu</w:t>
-      </w:r>
-      <w:r>
-        <w:rPr>
-          <w:rFonts w:ascii="Aptos" w:hAnsi="Aptos" w:eastAsia="Aptos" w:cs="Aptos"/>
-          <w:noProof w:val="0"/>
-          <w:sz w:val="20"/>
-          <w:szCs w:val="20"/>
-          <w:lang w:val="en-GB"/>
-        </w:rPr>
-        <w:t>t</w:t>
-      </w:r>
-      <w:r>
-        <w:rPr>
-          <w:rFonts w:ascii="Aptos" w:hAnsi="Aptos" w:eastAsia="Aptos" w:cs="Aptos"/>
-          <w:noProof w:val="0"/>
-          <w:sz w:val="20"/>
-          <w:szCs w:val="20"/>
-          <w:lang w:val="en-GB"/>
-        </w:rPr>
-        <w:t>s</w:t>
-      </w:r>
-      <w:r>
-        <w:rPr>
-          <w:rFonts w:ascii="Aptos" w:hAnsi="Aptos" w:eastAsia="Aptos" w:cs="Aptos"/>
-          <w:noProof w:val="0"/>
-          <w:sz w:val="20"/>
-          <w:szCs w:val="20"/>
-          <w:lang w:val="en-GB"/>
-        </w:rPr>
-        <w:t xml:space="preserve"> a gap in the bottom sequence.</w:t>
+        <w:drawing>
+          <wp:inline wp14:editId="21B9BD26" wp14:anchorId="5D815577">
+            <wp:extent cx="4076427" cy="4103740"/>
+            <wp:effectExtent l="0" t="0" r="0" b="0"/>
+            <wp:docPr id="459540453" name="drawing"/>
+            <wp:cNvGraphicFramePr>
+              <a:graphicFrameLocks noChangeAspect="1"/>
+            </wp:cNvGraphicFramePr>
+            <a:graphic>
+              <a:graphicData xmlns:a="http://schemas.openxmlformats.org/drawingml/2006/main" uri="http://schemas.openxmlformats.org/drawingml/2006/picture">
+                <pic:pic xmlns:pic="http://schemas.openxmlformats.org/drawingml/2006/picture">
+                  <pic:nvPicPr>
+                    <pic:cNvPr id="459540453" name="Picture 459540453"/>
+                    <pic:cNvPicPr/>
+                  </pic:nvPicPr>
+                  <pic:blipFill>
+                    <a:blip xmlns:r="http://schemas.openxmlformats.org/officeDocument/2006/relationships" r:embed="rId1182465504">
+                      <a:extLst>
+                        <a:ext uri="{28A0092B-C50C-407E-A947-70E740481C1C}">
+                          <a14:useLocalDpi xmlns:a14="http://schemas.microsoft.com/office/drawing/2010/main"/>
+                        </a:ext>
+                      </a:extLst>
+                    </a:blip>
+                    <a:stretch>
+                      <a:fillRect/>
+                    </a:stretch>
+                  </pic:blipFill>
+                  <pic:spPr>
+                    <a:xfrm rot="0">
+                      <a:off x="0" y="0"/>
+                      <a:ext cx="4076427" cy="4103740"/>
+                    </a:xfrm>
+                    <a:prstGeom prst="rect">
+                      <a:avLst/>
+                    </a:prstGeom>
+                  </pic:spPr>
+                </pic:pic>
+              </a:graphicData>
+            </a:graphic>
+          </wp:inline>
+        </w:drawing>
       </w:r>
     </w:p>
     <w:p>
@@ -3707,132 +3399,1312 @@
         <w:rPr>
           <w:rFonts w:ascii="Aptos" w:hAnsi="Aptos" w:eastAsia="Aptos" w:cs="Aptos"/>
           <w:noProof w:val="0"/>
-          <w:sz w:val="20"/>
-          <w:szCs w:val="20"/>
-          <w:lang w:val="en-GB"/>
-        </w:rPr>
-        <w:t>This uses the scores already stored in the matrix, which is part of dynamic programming</w:t>
-      </w:r>
-      <w:r>
-        <w:rPr>
-          <w:rFonts w:ascii="Aptos" w:hAnsi="Aptos" w:eastAsia="Aptos" w:cs="Aptos"/>
-          <w:noProof w:val="0"/>
-          <w:sz w:val="20"/>
-          <w:szCs w:val="20"/>
-          <w:lang w:val="en-GB"/>
-        </w:rPr>
-        <w:t xml:space="preserve"> which is why I</w:t>
-      </w:r>
-      <w:r>
-        <w:rPr>
-          <w:rFonts w:ascii="Aptos" w:hAnsi="Aptos" w:eastAsia="Aptos" w:cs="Aptos"/>
-          <w:noProof w:val="0"/>
-          <w:sz w:val="20"/>
-          <w:szCs w:val="20"/>
-          <w:lang w:val="en-GB"/>
-        </w:rPr>
-        <w:t xml:space="preserve"> reverse the result because I followed the path backwards.</w:t>
+          <w:sz w:val="22"/>
+          <w:szCs w:val="22"/>
+          <w:lang w:val="en-GB"/>
+        </w:rPr>
+        <w:t>My rough working shows how I calculated the first cell comparing C with A. I checked the diagonal, above and left scores, then chose the highest result which is −1. I used the same method to fill the remaining cells.</w:t>
       </w:r>
     </w:p>
     <w:p>
       <w:pPr>
         <w:pStyle w:val="Normal"/>
         <w:rPr>
-          <w:rFonts w:ascii="Aptos" w:hAnsi="Aptos" w:eastAsia="Aptos" w:cs="Aptos" w:asciiTheme="minorAscii" w:hAnsiTheme="minorAscii" w:eastAsiaTheme="minorAscii" w:cstheme="minorAscii"/>
-          <w:b w:val="1"/>
-          <w:bCs w:val="1"/>
-          <w:noProof w:val="0"/>
-          <w:sz w:val="32"/>
-          <w:szCs w:val="32"/>
-          <w:highlight w:val="green"/>
-          <w:u w:val="none"/>
+          <w:rFonts w:ascii="Aptos" w:hAnsi="Aptos" w:eastAsia="Aptos" w:cs="Aptos"/>
+          <w:noProof w:val="0"/>
+          <w:sz w:val="22"/>
+          <w:szCs w:val="22"/>
           <w:lang w:val="en-GB"/>
         </w:rPr>
       </w:pPr>
-      <w:r>
-        <w:rPr>
-          <w:rFonts w:ascii="Aptos" w:hAnsi="Aptos" w:eastAsia="Aptos" w:cs="Aptos" w:asciiTheme="minorAscii" w:hAnsiTheme="minorAscii" w:eastAsiaTheme="minorAscii" w:cstheme="minorAscii"/>
-          <w:b w:val="1"/>
-          <w:bCs w:val="1"/>
-          <w:noProof w:val="0"/>
-          <w:sz w:val="32"/>
-          <w:szCs w:val="32"/>
-          <w:highlight w:val="green"/>
-          <w:u w:val="none"/>
-          <w:lang w:val="en-GB"/>
-        </w:rPr>
-        <w:t>ATTACA-CG-</w:t>
-      </w:r>
-      <w:r>
-        <w:br/>
-      </w:r>
-      <w:r>
-        <w:rPr>
-          <w:rFonts w:ascii="Aptos" w:hAnsi="Aptos" w:eastAsia="Aptos" w:cs="Aptos" w:asciiTheme="minorAscii" w:hAnsiTheme="minorAscii" w:eastAsiaTheme="minorAscii" w:cstheme="minorAscii"/>
-          <w:b w:val="1"/>
-          <w:bCs w:val="1"/>
-          <w:noProof w:val="0"/>
-          <w:sz w:val="32"/>
-          <w:szCs w:val="32"/>
-          <w:highlight w:val="green"/>
-          <w:u w:val="none"/>
-          <w:lang w:val="en-GB"/>
-        </w:rPr>
-        <w:t>--CACAGAGT</w:t>
-      </w:r>
     </w:p>
     <w:p>
       <w:pPr>
         <w:pStyle w:val="Normal"/>
         <w:rPr>
           <w:rFonts w:ascii="Aptos" w:hAnsi="Aptos" w:eastAsia="Aptos" w:cs="Aptos"/>
-          <w:noProof w:val="0"/>
-          <w:sz w:val="20"/>
-          <w:szCs w:val="20"/>
+          <w:b w:val="1"/>
+          <w:bCs w:val="1"/>
+          <w:noProof w:val="0"/>
+          <w:sz w:val="22"/>
+          <w:szCs w:val="22"/>
+          <w:u w:val="single"/>
+          <w:lang w:val="en-GB"/>
+        </w:rPr>
+      </w:pPr>
+      <w:r>
+        <w:rPr>
+          <w:rFonts w:ascii="Aptos" w:hAnsi="Aptos" w:eastAsia="Aptos" w:cs="Aptos"/>
+          <w:b w:val="1"/>
+          <w:bCs w:val="1"/>
+          <w:noProof w:val="0"/>
+          <w:sz w:val="22"/>
+          <w:szCs w:val="22"/>
+          <w:u w:val="single"/>
+          <w:lang w:val="en-GB"/>
+        </w:rPr>
+        <w:t xml:space="preserve">The </w:t>
+      </w:r>
+      <w:r>
+        <w:rPr>
+          <w:rFonts w:ascii="Aptos" w:hAnsi="Aptos" w:eastAsia="Aptos" w:cs="Aptos"/>
+          <w:b w:val="1"/>
+          <w:bCs w:val="1"/>
+          <w:noProof w:val="0"/>
+          <w:sz w:val="22"/>
+          <w:szCs w:val="22"/>
+          <w:u w:val="single"/>
+          <w:lang w:val="en-GB"/>
+        </w:rPr>
+        <w:t>Traceback</w:t>
+      </w:r>
+    </w:p>
+    <w:p>
+      <w:pPr>
+        <w:pStyle w:val="Normal"/>
+        <w:rPr>
+          <w:rFonts w:ascii="Aptos" w:hAnsi="Aptos" w:eastAsia="Aptos" w:cs="Aptos"/>
+          <w:noProof w:val="0"/>
+          <w:sz w:val="20"/>
+          <w:szCs w:val="20"/>
+          <w:lang w:val="en-GB"/>
+        </w:rPr>
+      </w:pPr>
+      <w:r>
+        <w:rPr>
+          <w:rFonts w:ascii="Aptos" w:hAnsi="Aptos" w:eastAsia="Aptos" w:cs="Aptos"/>
+          <w:noProof w:val="0"/>
+          <w:sz w:val="20"/>
+          <w:szCs w:val="20"/>
+          <w:lang w:val="en-GB"/>
+        </w:rPr>
+        <w:t xml:space="preserve">The starting scores decrease by 1 because each step </w:t>
+      </w:r>
+      <w:r>
+        <w:rPr>
+          <w:rFonts w:ascii="Aptos" w:hAnsi="Aptos" w:eastAsia="Aptos" w:cs="Aptos"/>
+          <w:noProof w:val="0"/>
+          <w:sz w:val="20"/>
+          <w:szCs w:val="20"/>
+          <w:lang w:val="en-GB"/>
+        </w:rPr>
+        <w:t>represents</w:t>
+      </w:r>
+      <w:r>
+        <w:rPr>
+          <w:rFonts w:ascii="Aptos" w:hAnsi="Aptos" w:eastAsia="Aptos" w:cs="Aptos"/>
+          <w:noProof w:val="0"/>
+          <w:sz w:val="20"/>
+          <w:szCs w:val="20"/>
+          <w:lang w:val="en-GB"/>
+        </w:rPr>
+        <w:t xml:space="preserve"> adding a </w:t>
+      </w:r>
+      <w:r>
+        <w:rPr>
+          <w:rFonts w:ascii="Aptos" w:hAnsi="Aptos" w:eastAsia="Aptos" w:cs="Aptos"/>
+          <w:noProof w:val="0"/>
+          <w:sz w:val="20"/>
+          <w:szCs w:val="20"/>
+          <w:lang w:val="en-GB"/>
+        </w:rPr>
+        <w:t>gap,</w:t>
+      </w:r>
+      <w:r>
+        <w:rPr>
+          <w:rFonts w:ascii="Aptos" w:hAnsi="Aptos" w:eastAsia="Aptos" w:cs="Aptos"/>
+          <w:noProof w:val="0"/>
+          <w:sz w:val="20"/>
+          <w:szCs w:val="20"/>
+          <w:lang w:val="en-GB"/>
+        </w:rPr>
+        <w:t xml:space="preserve"> so </w:t>
+      </w:r>
+      <w:r>
+        <w:rPr>
+          <w:rFonts w:ascii="Aptos" w:hAnsi="Aptos" w:eastAsia="Aptos" w:cs="Aptos"/>
+          <w:noProof w:val="0"/>
+          <w:sz w:val="20"/>
+          <w:szCs w:val="20"/>
+          <w:lang w:val="en-GB"/>
+        </w:rPr>
+        <w:t>I start</w:t>
+      </w:r>
+      <w:r>
+        <w:rPr>
+          <w:rFonts w:ascii="Aptos" w:hAnsi="Aptos" w:eastAsia="Aptos" w:cs="Aptos"/>
+          <w:noProof w:val="0"/>
+          <w:sz w:val="20"/>
+          <w:szCs w:val="20"/>
+          <w:lang w:val="en-GB"/>
+        </w:rPr>
+        <w:t xml:space="preserve"> at the bottom-right cell and work backwards to the 0 in the top-left. The path shows which letters or gaps form the final alignment. </w:t>
+      </w:r>
+    </w:p>
+    <w:p>
+      <w:pPr>
+        <w:pStyle w:val="Normal"/>
+        <w:rPr>
+          <w:rFonts w:ascii="Aptos" w:hAnsi="Aptos" w:eastAsia="Aptos" w:cs="Aptos"/>
+          <w:noProof w:val="0"/>
+          <w:sz w:val="20"/>
+          <w:szCs w:val="20"/>
+          <w:lang w:val="en-GB"/>
+        </w:rPr>
+      </w:pPr>
+      <w:r>
+        <w:rPr>
+          <w:rFonts w:ascii="Aptos" w:hAnsi="Aptos" w:eastAsia="Aptos" w:cs="Aptos"/>
+          <w:noProof w:val="0"/>
+          <w:sz w:val="20"/>
+          <w:szCs w:val="20"/>
+          <w:lang w:val="en-GB"/>
+        </w:rPr>
+        <w:t xml:space="preserve">For </w:t>
+      </w:r>
+      <w:r>
+        <w:rPr>
+          <w:rFonts w:ascii="Aptos" w:hAnsi="Aptos" w:eastAsia="Aptos" w:cs="Aptos"/>
+          <w:noProof w:val="0"/>
+          <w:sz w:val="20"/>
+          <w:szCs w:val="20"/>
+          <w:lang w:val="en-GB"/>
+        </w:rPr>
+        <w:t>reference</w:t>
+      </w:r>
+      <w:r>
+        <w:rPr>
+          <w:rFonts w:ascii="Aptos" w:hAnsi="Aptos" w:eastAsia="Aptos" w:cs="Aptos"/>
+          <w:noProof w:val="0"/>
+          <w:sz w:val="20"/>
+          <w:szCs w:val="20"/>
+          <w:lang w:val="en-GB"/>
+        </w:rPr>
+        <w:t xml:space="preserve"> the starting point is </w:t>
+      </w:r>
+      <w:r>
+        <w:rPr>
+          <w:rFonts w:ascii="Aptos" w:hAnsi="Aptos" w:eastAsia="Aptos" w:cs="Aptos"/>
+          <w:noProof w:val="0"/>
+          <w:sz w:val="20"/>
+          <w:szCs w:val="20"/>
+          <w:lang w:val="en-GB"/>
+        </w:rPr>
+        <w:t xml:space="preserve">highlighted </w:t>
+      </w:r>
+      <w:r>
+        <w:rPr>
+          <w:rFonts w:ascii="Aptos" w:hAnsi="Aptos" w:eastAsia="Aptos" w:cs="Aptos"/>
+          <w:noProof w:val="0"/>
+          <w:sz w:val="20"/>
+          <w:szCs w:val="20"/>
+          <w:lang w:val="en-GB"/>
+        </w:rPr>
+        <w:t xml:space="preserve">as </w:t>
+      </w:r>
+      <w:r>
+        <w:rPr>
+          <w:rFonts w:ascii="Aptos" w:hAnsi="Aptos" w:eastAsia="Aptos" w:cs="Aptos"/>
+          <w:noProof w:val="0"/>
+          <w:sz w:val="20"/>
+          <w:szCs w:val="20"/>
+          <w:highlight w:val="cyan"/>
+          <w:lang w:val="en-GB"/>
+        </w:rPr>
+        <w:t>blue</w:t>
+      </w:r>
+      <w:r>
+        <w:rPr>
+          <w:rFonts w:ascii="Aptos" w:hAnsi="Aptos" w:eastAsia="Aptos" w:cs="Aptos"/>
+          <w:noProof w:val="0"/>
+          <w:sz w:val="20"/>
+          <w:szCs w:val="20"/>
+          <w:highlight w:val="cyan"/>
+          <w:lang w:val="en-GB"/>
+        </w:rPr>
+        <w:t xml:space="preserve"> </w:t>
+      </w:r>
+      <w:r>
+        <w:rPr>
+          <w:rFonts w:ascii="Aptos" w:hAnsi="Aptos" w:eastAsia="Aptos" w:cs="Aptos"/>
+          <w:noProof w:val="0"/>
+          <w:sz w:val="20"/>
+          <w:szCs w:val="20"/>
+          <w:lang w:val="en-GB"/>
+        </w:rPr>
+        <w:t>which is the</w:t>
+      </w:r>
+      <w:r>
+        <w:rPr>
+          <w:rFonts w:ascii="Aptos" w:hAnsi="Aptos" w:eastAsia="Aptos" w:cs="Aptos"/>
+          <w:noProof w:val="0"/>
+          <w:sz w:val="20"/>
+          <w:szCs w:val="20"/>
+          <w:lang w:val="en-GB"/>
+        </w:rPr>
+        <w:t xml:space="preserve"> b</w:t>
+      </w:r>
+      <w:r>
+        <w:rPr>
+          <w:rFonts w:ascii="Aptos" w:hAnsi="Aptos" w:eastAsia="Aptos" w:cs="Aptos"/>
+          <w:noProof w:val="0"/>
+          <w:sz w:val="20"/>
+          <w:szCs w:val="20"/>
+          <w:lang w:val="en-GB"/>
+        </w:rPr>
+        <w:t>ottom-right cell,</w:t>
+      </w:r>
+      <w:r>
+        <w:rPr>
+          <w:rFonts w:ascii="Aptos" w:hAnsi="Aptos" w:eastAsia="Aptos" w:cs="Aptos"/>
+          <w:noProof w:val="0"/>
+          <w:sz w:val="20"/>
+          <w:szCs w:val="20"/>
+          <w:lang w:val="en-GB"/>
+        </w:rPr>
+        <w:t xml:space="preserve"> with</w:t>
+      </w:r>
+      <w:r>
+        <w:rPr>
+          <w:rFonts w:ascii="Aptos" w:hAnsi="Aptos" w:eastAsia="Aptos" w:cs="Aptos"/>
+          <w:noProof w:val="0"/>
+          <w:sz w:val="20"/>
+          <w:szCs w:val="20"/>
+          <w:lang w:val="en-GB"/>
+        </w:rPr>
+        <w:t xml:space="preserve"> a score of −2</w:t>
+      </w:r>
+      <w:r>
+        <w:rPr>
+          <w:rFonts w:ascii="Aptos" w:hAnsi="Aptos" w:eastAsia="Aptos" w:cs="Aptos"/>
+          <w:noProof w:val="0"/>
+          <w:sz w:val="20"/>
+          <w:szCs w:val="20"/>
+          <w:lang w:val="en-GB"/>
+        </w:rPr>
+        <w:t xml:space="preserve"> and </w:t>
+      </w:r>
+      <w:r>
+        <w:rPr>
+          <w:rFonts w:ascii="Aptos" w:hAnsi="Aptos" w:eastAsia="Aptos" w:cs="Aptos"/>
+          <w:noProof w:val="0"/>
+          <w:sz w:val="20"/>
+          <w:szCs w:val="20"/>
+          <w:lang w:val="en-GB"/>
+        </w:rPr>
+        <w:t>I follow the highlighted cells backwards to 0</w:t>
+      </w:r>
+      <w:r>
+        <w:rPr>
+          <w:rFonts w:ascii="Aptos" w:hAnsi="Aptos" w:eastAsia="Aptos" w:cs="Aptos"/>
+          <w:noProof w:val="0"/>
+          <w:sz w:val="20"/>
+          <w:szCs w:val="20"/>
+          <w:lang w:val="en-GB"/>
+        </w:rPr>
+        <w:t xml:space="preserve"> </w:t>
+      </w:r>
+      <w:r>
+        <w:rPr>
+          <w:rFonts w:ascii="Aptos" w:hAnsi="Aptos" w:eastAsia="Aptos" w:cs="Aptos"/>
+          <w:noProof w:val="0"/>
+          <w:sz w:val="20"/>
+          <w:szCs w:val="20"/>
+          <w:lang w:val="en-GB"/>
+        </w:rPr>
+        <w:t>highlighted</w:t>
+      </w:r>
+      <w:r>
+        <w:rPr>
+          <w:rFonts w:ascii="Aptos" w:hAnsi="Aptos" w:eastAsia="Aptos" w:cs="Aptos"/>
+          <w:noProof w:val="0"/>
+          <w:sz w:val="20"/>
+          <w:szCs w:val="20"/>
+          <w:lang w:val="en-GB"/>
+        </w:rPr>
+        <w:t xml:space="preserve"> in </w:t>
+      </w:r>
+      <w:r>
+        <w:rPr>
+          <w:rFonts w:ascii="Aptos" w:hAnsi="Aptos" w:eastAsia="Aptos" w:cs="Aptos"/>
+          <w:noProof w:val="0"/>
+          <w:sz w:val="20"/>
+          <w:szCs w:val="20"/>
+          <w:highlight w:val="green"/>
+          <w:lang w:val="en-GB"/>
+        </w:rPr>
+        <w:t>green</w:t>
+      </w:r>
+      <w:r>
+        <w:rPr>
+          <w:rFonts w:ascii="Aptos" w:hAnsi="Aptos" w:eastAsia="Aptos" w:cs="Aptos"/>
+          <w:noProof w:val="0"/>
+          <w:sz w:val="20"/>
+          <w:szCs w:val="20"/>
+          <w:lang w:val="en-GB"/>
+        </w:rPr>
+        <w:t>.</w:t>
+      </w:r>
+    </w:p>
+    <w:p>
+      <w:pPr>
+        <w:pStyle w:val="Normal"/>
+      </w:pPr>
+      <w:r>
+        <w:rPr>
+          <w:rFonts w:ascii="Aptos" w:hAnsi="Aptos" w:eastAsia="Aptos" w:cs="Aptos"/>
+          <w:noProof w:val="0"/>
+          <w:sz w:val="20"/>
+          <w:szCs w:val="20"/>
+          <w:lang w:val="en-GB"/>
+        </w:rPr>
+        <w:t xml:space="preserve">My moves </w:t>
+      </w:r>
+      <w:r>
+        <w:rPr>
+          <w:rFonts w:ascii="Aptos" w:hAnsi="Aptos" w:eastAsia="Aptos" w:cs="Aptos"/>
+          <w:noProof w:val="0"/>
+          <w:sz w:val="20"/>
+          <w:szCs w:val="20"/>
+          <w:lang w:val="en-GB"/>
+        </w:rPr>
+        <w:t>are</w:t>
+      </w:r>
+      <w:r>
+        <w:rPr>
+          <w:rFonts w:ascii="Aptos" w:hAnsi="Aptos" w:eastAsia="Aptos" w:cs="Aptos"/>
+          <w:noProof w:val="0"/>
+          <w:sz w:val="20"/>
+          <w:szCs w:val="20"/>
+          <w:lang w:val="en-GB"/>
+        </w:rPr>
+        <w:t xml:space="preserve"> up, diagonal, diagonal, up, diagonal, diagonal, diagonal, diagonal, left and left</w:t>
+      </w:r>
+      <w:r>
+        <w:rPr>
+          <w:rFonts w:ascii="Aptos" w:hAnsi="Aptos" w:eastAsia="Aptos" w:cs="Aptos"/>
+          <w:noProof w:val="0"/>
+          <w:sz w:val="20"/>
+          <w:szCs w:val="20"/>
+          <w:lang w:val="en-GB"/>
+        </w:rPr>
+        <w:t xml:space="preserve"> </w:t>
+      </w:r>
+      <w:r>
+        <w:rPr>
+          <w:rFonts w:ascii="Aptos" w:hAnsi="Aptos" w:eastAsia="Aptos" w:cs="Aptos"/>
+          <w:noProof w:val="0"/>
+          <w:sz w:val="20"/>
+          <w:szCs w:val="20"/>
+          <w:lang w:val="en-GB"/>
+        </w:rPr>
+        <w:t>where</w:t>
+      </w:r>
+      <w:r>
+        <w:rPr>
+          <w:rFonts w:ascii="Aptos" w:hAnsi="Aptos" w:eastAsia="Aptos" w:cs="Aptos"/>
+          <w:noProof w:val="0"/>
+          <w:sz w:val="20"/>
+          <w:szCs w:val="20"/>
+          <w:lang w:val="en-GB"/>
+        </w:rPr>
+        <w:t xml:space="preserve"> each</w:t>
+      </w:r>
+      <w:r>
+        <w:rPr>
+          <w:rFonts w:ascii="Aptos" w:hAnsi="Aptos" w:eastAsia="Aptos" w:cs="Aptos"/>
+          <w:noProof w:val="0"/>
+          <w:sz w:val="20"/>
+          <w:szCs w:val="20"/>
+          <w:lang w:val="en-GB"/>
+        </w:rPr>
+        <w:t xml:space="preserve"> move tells me what to align</w:t>
+      </w:r>
+      <w:r>
+        <w:rPr>
+          <w:rFonts w:ascii="Aptos" w:hAnsi="Aptos" w:eastAsia="Aptos" w:cs="Aptos"/>
+          <w:noProof w:val="0"/>
+          <w:sz w:val="20"/>
+          <w:szCs w:val="20"/>
+          <w:lang w:val="en-GB"/>
+        </w:rPr>
+        <w:t xml:space="preserve">. </w:t>
+      </w:r>
+      <w:r>
+        <w:rPr>
+          <w:rFonts w:ascii="Aptos" w:hAnsi="Aptos" w:eastAsia="Aptos" w:cs="Aptos"/>
+          <w:noProof w:val="0"/>
+          <w:sz w:val="20"/>
+          <w:szCs w:val="20"/>
+          <w:lang w:val="en-GB"/>
+        </w:rPr>
+        <w:t>Moving d</w:t>
+      </w:r>
+      <w:r>
+        <w:rPr>
+          <w:rFonts w:ascii="Aptos" w:hAnsi="Aptos" w:eastAsia="Aptos" w:cs="Aptos"/>
+          <w:noProof w:val="0"/>
+          <w:sz w:val="20"/>
+          <w:szCs w:val="20"/>
+          <w:lang w:val="en-GB"/>
+        </w:rPr>
+        <w:t>iagonal</w:t>
+      </w:r>
+      <w:r>
+        <w:rPr>
+          <w:rFonts w:ascii="Aptos" w:hAnsi="Aptos" w:eastAsia="Aptos" w:cs="Aptos"/>
+          <w:noProof w:val="0"/>
+          <w:sz w:val="20"/>
+          <w:szCs w:val="20"/>
+          <w:lang w:val="en-GB"/>
+        </w:rPr>
+        <w:t xml:space="preserve"> </w:t>
+      </w:r>
+      <w:r>
+        <w:rPr>
+          <w:rFonts w:ascii="Aptos" w:hAnsi="Aptos" w:eastAsia="Aptos" w:cs="Aptos"/>
+          <w:noProof w:val="0"/>
+          <w:sz w:val="20"/>
+          <w:szCs w:val="20"/>
+          <w:lang w:val="en-GB"/>
+        </w:rPr>
+        <w:t>align</w:t>
+      </w:r>
+      <w:r>
+        <w:rPr>
+          <w:rFonts w:ascii="Aptos" w:hAnsi="Aptos" w:eastAsia="Aptos" w:cs="Aptos"/>
+          <w:noProof w:val="0"/>
+          <w:sz w:val="20"/>
+          <w:szCs w:val="20"/>
+          <w:lang w:val="en-GB"/>
+        </w:rPr>
+        <w:t>s</w:t>
+      </w:r>
+      <w:r>
+        <w:rPr>
+          <w:rFonts w:ascii="Aptos" w:hAnsi="Aptos" w:eastAsia="Aptos" w:cs="Aptos"/>
+          <w:noProof w:val="0"/>
+          <w:sz w:val="20"/>
+          <w:szCs w:val="20"/>
+          <w:lang w:val="en-GB"/>
+        </w:rPr>
+        <w:t xml:space="preserve"> two letters</w:t>
+      </w:r>
+      <w:r>
+        <w:rPr>
+          <w:rFonts w:ascii="Aptos" w:hAnsi="Aptos" w:eastAsia="Aptos" w:cs="Aptos"/>
+          <w:noProof w:val="0"/>
+          <w:sz w:val="20"/>
+          <w:szCs w:val="20"/>
+          <w:lang w:val="en-GB"/>
+        </w:rPr>
+        <w:t>, moving up</w:t>
+      </w:r>
+      <w:r>
+        <w:rPr>
+          <w:rFonts w:ascii="Aptos" w:hAnsi="Aptos" w:eastAsia="Aptos" w:cs="Aptos"/>
+          <w:noProof w:val="0"/>
+          <w:sz w:val="20"/>
+          <w:szCs w:val="20"/>
+          <w:lang w:val="en-GB"/>
+        </w:rPr>
+        <w:t xml:space="preserve"> put</w:t>
+      </w:r>
+      <w:r>
+        <w:rPr>
+          <w:rFonts w:ascii="Aptos" w:hAnsi="Aptos" w:eastAsia="Aptos" w:cs="Aptos"/>
+          <w:noProof w:val="0"/>
+          <w:sz w:val="20"/>
+          <w:szCs w:val="20"/>
+          <w:lang w:val="en-GB"/>
+        </w:rPr>
+        <w:t>s</w:t>
+      </w:r>
+      <w:r>
+        <w:rPr>
+          <w:rFonts w:ascii="Aptos" w:hAnsi="Aptos" w:eastAsia="Aptos" w:cs="Aptos"/>
+          <w:noProof w:val="0"/>
+          <w:sz w:val="20"/>
+          <w:szCs w:val="20"/>
+          <w:lang w:val="en-GB"/>
+        </w:rPr>
+        <w:t xml:space="preserve"> a gap in the top sequence</w:t>
+      </w:r>
+      <w:r>
+        <w:rPr>
+          <w:rFonts w:ascii="Aptos" w:hAnsi="Aptos" w:eastAsia="Aptos" w:cs="Aptos"/>
+          <w:noProof w:val="0"/>
+          <w:sz w:val="20"/>
+          <w:szCs w:val="20"/>
+          <w:lang w:val="en-GB"/>
+        </w:rPr>
+        <w:t xml:space="preserve"> and moving l</w:t>
+      </w:r>
+      <w:r>
+        <w:rPr>
+          <w:rFonts w:ascii="Aptos" w:hAnsi="Aptos" w:eastAsia="Aptos" w:cs="Aptos"/>
+          <w:noProof w:val="0"/>
+          <w:sz w:val="20"/>
+          <w:szCs w:val="20"/>
+          <w:lang w:val="en-GB"/>
+        </w:rPr>
+        <w:t>eft</w:t>
+      </w:r>
+      <w:r>
+        <w:rPr>
+          <w:rFonts w:ascii="Aptos" w:hAnsi="Aptos" w:eastAsia="Aptos" w:cs="Aptos"/>
+          <w:noProof w:val="0"/>
+          <w:sz w:val="20"/>
+          <w:szCs w:val="20"/>
+          <w:lang w:val="en-GB"/>
+        </w:rPr>
+        <w:t xml:space="preserve"> pu</w:t>
+      </w:r>
+      <w:r>
+        <w:rPr>
+          <w:rFonts w:ascii="Aptos" w:hAnsi="Aptos" w:eastAsia="Aptos" w:cs="Aptos"/>
+          <w:noProof w:val="0"/>
+          <w:sz w:val="20"/>
+          <w:szCs w:val="20"/>
+          <w:lang w:val="en-GB"/>
+        </w:rPr>
+        <w:t>t</w:t>
+      </w:r>
+      <w:r>
+        <w:rPr>
+          <w:rFonts w:ascii="Aptos" w:hAnsi="Aptos" w:eastAsia="Aptos" w:cs="Aptos"/>
+          <w:noProof w:val="0"/>
+          <w:sz w:val="20"/>
+          <w:szCs w:val="20"/>
+          <w:lang w:val="en-GB"/>
+        </w:rPr>
+        <w:t>s</w:t>
+      </w:r>
+      <w:r>
+        <w:rPr>
+          <w:rFonts w:ascii="Aptos" w:hAnsi="Aptos" w:eastAsia="Aptos" w:cs="Aptos"/>
+          <w:noProof w:val="0"/>
+          <w:sz w:val="20"/>
+          <w:szCs w:val="20"/>
+          <w:lang w:val="en-GB"/>
+        </w:rPr>
+        <w:t xml:space="preserve"> a gap in the bottom sequence.</w:t>
+      </w:r>
+    </w:p>
+    <w:p>
+      <w:pPr>
+        <w:pStyle w:val="Normal"/>
+      </w:pPr>
+      <w:r>
+        <w:rPr>
+          <w:rFonts w:ascii="Aptos" w:hAnsi="Aptos" w:eastAsia="Aptos" w:cs="Aptos"/>
+          <w:noProof w:val="0"/>
+          <w:sz w:val="20"/>
+          <w:szCs w:val="20"/>
+          <w:lang w:val="en-GB"/>
+        </w:rPr>
+        <w:t>This uses the scores already stored in the matrix, which is part of dynamic programming</w:t>
+      </w:r>
+      <w:r>
+        <w:rPr>
+          <w:rFonts w:ascii="Aptos" w:hAnsi="Aptos" w:eastAsia="Aptos" w:cs="Aptos"/>
+          <w:noProof w:val="0"/>
+          <w:sz w:val="20"/>
+          <w:szCs w:val="20"/>
+          <w:lang w:val="en-GB"/>
+        </w:rPr>
+        <w:t xml:space="preserve"> which is why I</w:t>
+      </w:r>
+      <w:r>
+        <w:rPr>
+          <w:rFonts w:ascii="Aptos" w:hAnsi="Aptos" w:eastAsia="Aptos" w:cs="Aptos"/>
+          <w:noProof w:val="0"/>
+          <w:sz w:val="20"/>
+          <w:szCs w:val="20"/>
+          <w:lang w:val="en-GB"/>
+        </w:rPr>
+        <w:t xml:space="preserve"> reverse the result because I followed the path backwards.</w:t>
+      </w:r>
+    </w:p>
+    <w:p>
+      <w:pPr>
+        <w:pStyle w:val="Normal"/>
+        <w:rPr>
+          <w:rFonts w:ascii="Aptos" w:hAnsi="Aptos" w:eastAsia="Aptos" w:cs="Aptos"/>
+          <w:b w:val="1"/>
+          <w:bCs w:val="1"/>
+          <w:noProof w:val="0"/>
+          <w:sz w:val="22"/>
+          <w:szCs w:val="22"/>
+          <w:u w:val="single"/>
           <w:lang w:val="en-GB"/>
         </w:rPr>
       </w:pPr>
     </w:p>
     <w:p>
       <w:pPr>
-        <w:spacing w:before="240" w:beforeAutospacing="off" w:after="240" w:afterAutospacing="off"/>
-        <w:rPr>
-          <w:rFonts w:ascii="Aptos" w:hAnsi="Aptos" w:eastAsia="Aptos" w:cs="Aptos"/>
-          <w:noProof w:val="0"/>
-          <w:sz w:val="20"/>
-          <w:szCs w:val="20"/>
+        <w:pStyle w:val="Normal"/>
+        <w:rPr>
+          <w:rFonts w:ascii="Aptos" w:hAnsi="Aptos" w:eastAsia="Aptos" w:cs="Aptos"/>
+          <w:b w:val="1"/>
+          <w:bCs w:val="1"/>
+          <w:noProof w:val="0"/>
+          <w:sz w:val="22"/>
+          <w:szCs w:val="22"/>
+          <w:u w:val="single"/>
           <w:lang w:val="en-GB"/>
         </w:rPr>
       </w:pPr>
-      <w:r>
-        <w:rPr>
-          <w:rFonts w:ascii="Aptos" w:hAnsi="Aptos" w:eastAsia="Aptos" w:cs="Aptos"/>
-          <w:noProof w:val="0"/>
-          <w:sz w:val="20"/>
-          <w:szCs w:val="20"/>
-          <w:lang w:val="en-GB"/>
-        </w:rPr>
-        <w:t xml:space="preserve">A dash </w:t>
-      </w:r>
-      <w:r>
-        <w:rPr>
-          <w:rFonts w:ascii="Aptos" w:hAnsi="Aptos" w:eastAsia="Aptos" w:cs="Aptos"/>
-          <w:noProof w:val="0"/>
-          <w:sz w:val="20"/>
-          <w:szCs w:val="20"/>
-          <w:lang w:val="en-GB"/>
-        </w:rPr>
-        <w:t>represents</w:t>
-      </w:r>
-      <w:r>
-        <w:rPr>
-          <w:rFonts w:ascii="Aptos" w:hAnsi="Aptos" w:eastAsia="Aptos" w:cs="Aptos"/>
-          <w:noProof w:val="0"/>
-          <w:sz w:val="20"/>
-          <w:szCs w:val="20"/>
-          <w:lang w:val="en-GB"/>
-        </w:rPr>
-        <w:t xml:space="preserve"> a gap therefore removing the gaps gives the two original sequences.</w:t>
+    </w:p>
+    <w:p>
+      <w:pPr>
+        <w:pStyle w:val="Normal"/>
+        <w:rPr>
+          <w:rFonts w:ascii="Aptos" w:hAnsi="Aptos" w:eastAsia="Aptos" w:cs="Aptos"/>
+          <w:b w:val="1"/>
+          <w:bCs w:val="1"/>
+          <w:noProof w:val="0"/>
+          <w:sz w:val="22"/>
+          <w:szCs w:val="22"/>
+          <w:u w:val="single"/>
+          <w:lang w:val="en-GB"/>
+        </w:rPr>
+      </w:pPr>
+    </w:p>
+    <w:p>
+      <w:pPr>
+        <w:pStyle w:val="Normal"/>
+        <w:rPr>
+          <w:rFonts w:ascii="Aptos" w:hAnsi="Aptos" w:eastAsia="Aptos" w:cs="Aptos"/>
+          <w:b w:val="1"/>
+          <w:bCs w:val="1"/>
+          <w:noProof w:val="0"/>
+          <w:sz w:val="22"/>
+          <w:szCs w:val="22"/>
+          <w:u w:val="single"/>
+          <w:lang w:val="en-GB"/>
+        </w:rPr>
+      </w:pPr>
+    </w:p>
+    <w:p>
+      <w:pPr>
+        <w:pStyle w:val="Normal"/>
+        <w:rPr>
+          <w:rFonts w:ascii="Aptos" w:hAnsi="Aptos" w:eastAsia="Aptos" w:cs="Aptos"/>
+          <w:b w:val="1"/>
+          <w:bCs w:val="1"/>
+          <w:noProof w:val="0"/>
+          <w:sz w:val="22"/>
+          <w:szCs w:val="22"/>
+          <w:u w:val="single"/>
+          <w:lang w:val="en-GB"/>
+        </w:rPr>
+      </w:pPr>
+      <w:r>
+        <w:rPr>
+          <w:rFonts w:ascii="Aptos" w:hAnsi="Aptos" w:eastAsia="Aptos" w:cs="Aptos"/>
+          <w:b w:val="1"/>
+          <w:bCs w:val="1"/>
+          <w:noProof w:val="0"/>
+          <w:sz w:val="22"/>
+          <w:szCs w:val="22"/>
+          <w:u w:val="single"/>
+          <w:lang w:val="en-GB"/>
+        </w:rPr>
+        <w:t>The Final alignment</w:t>
+      </w:r>
+    </w:p>
+    <w:p>
+      <w:pPr>
+        <w:pStyle w:val="Normal"/>
+        <w:rPr>
+          <w:rFonts w:ascii="Aptos" w:hAnsi="Aptos" w:eastAsia="Aptos" w:cs="Aptos" w:asciiTheme="minorAscii" w:hAnsiTheme="minorAscii" w:eastAsiaTheme="minorAscii" w:cstheme="minorAscii"/>
+          <w:b w:val="1"/>
+          <w:bCs w:val="1"/>
+          <w:noProof w:val="0"/>
+          <w:sz w:val="32"/>
+          <w:szCs w:val="32"/>
+          <w:highlight w:val="green"/>
+          <w:u w:val="none"/>
+          <w:lang w:val="en-GB"/>
+        </w:rPr>
+      </w:pPr>
+      <w:r>
+        <w:rPr>
+          <w:rFonts w:ascii="Aptos" w:hAnsi="Aptos" w:eastAsia="Aptos" w:cs="Aptos" w:asciiTheme="minorAscii" w:hAnsiTheme="minorAscii" w:eastAsiaTheme="minorAscii" w:cstheme="minorAscii"/>
+          <w:b w:val="1"/>
+          <w:bCs w:val="1"/>
+          <w:noProof w:val="0"/>
+          <w:sz w:val="32"/>
+          <w:szCs w:val="32"/>
+          <w:highlight w:val="green"/>
+          <w:u w:val="none"/>
+          <w:lang w:val="en-GB"/>
+        </w:rPr>
+        <w:t>A</w:t>
+      </w:r>
+      <w:r>
+        <w:rPr>
+          <w:rFonts w:ascii="Aptos" w:hAnsi="Aptos" w:eastAsia="Aptos" w:cs="Aptos" w:asciiTheme="minorAscii" w:hAnsiTheme="minorAscii" w:eastAsiaTheme="minorAscii" w:cstheme="minorAscii"/>
+          <w:b w:val="1"/>
+          <w:bCs w:val="1"/>
+          <w:noProof w:val="0"/>
+          <w:sz w:val="32"/>
+          <w:szCs w:val="32"/>
+          <w:highlight w:val="green"/>
+          <w:u w:val="none"/>
+          <w:lang w:val="en-GB"/>
+        </w:rPr>
+        <w:t xml:space="preserve"> </w:t>
+      </w:r>
+      <w:r>
+        <w:rPr>
+          <w:rFonts w:ascii="Aptos" w:hAnsi="Aptos" w:eastAsia="Aptos" w:cs="Aptos" w:asciiTheme="minorAscii" w:hAnsiTheme="minorAscii" w:eastAsiaTheme="minorAscii" w:cstheme="minorAscii"/>
+          <w:b w:val="1"/>
+          <w:bCs w:val="1"/>
+          <w:noProof w:val="0"/>
+          <w:sz w:val="32"/>
+          <w:szCs w:val="32"/>
+          <w:highlight w:val="green"/>
+          <w:u w:val="none"/>
+          <w:lang w:val="en-GB"/>
+        </w:rPr>
+        <w:t>T</w:t>
+      </w:r>
+      <w:r>
+        <w:rPr>
+          <w:rFonts w:ascii="Aptos" w:hAnsi="Aptos" w:eastAsia="Aptos" w:cs="Aptos" w:asciiTheme="minorAscii" w:hAnsiTheme="minorAscii" w:eastAsiaTheme="minorAscii" w:cstheme="minorAscii"/>
+          <w:b w:val="1"/>
+          <w:bCs w:val="1"/>
+          <w:noProof w:val="0"/>
+          <w:sz w:val="32"/>
+          <w:szCs w:val="32"/>
+          <w:highlight w:val="green"/>
+          <w:u w:val="none"/>
+          <w:lang w:val="en-GB"/>
+        </w:rPr>
+        <w:t xml:space="preserve"> </w:t>
+      </w:r>
+      <w:r>
+        <w:rPr>
+          <w:rFonts w:ascii="Aptos" w:hAnsi="Aptos" w:eastAsia="Aptos" w:cs="Aptos" w:asciiTheme="minorAscii" w:hAnsiTheme="minorAscii" w:eastAsiaTheme="minorAscii" w:cstheme="minorAscii"/>
+          <w:b w:val="1"/>
+          <w:bCs w:val="1"/>
+          <w:noProof w:val="0"/>
+          <w:sz w:val="32"/>
+          <w:szCs w:val="32"/>
+          <w:highlight w:val="green"/>
+          <w:u w:val="none"/>
+          <w:lang w:val="en-GB"/>
+        </w:rPr>
+        <w:t>T</w:t>
+      </w:r>
+      <w:r>
+        <w:rPr>
+          <w:rFonts w:ascii="Aptos" w:hAnsi="Aptos" w:eastAsia="Aptos" w:cs="Aptos" w:asciiTheme="minorAscii" w:hAnsiTheme="minorAscii" w:eastAsiaTheme="minorAscii" w:cstheme="minorAscii"/>
+          <w:b w:val="1"/>
+          <w:bCs w:val="1"/>
+          <w:noProof w:val="0"/>
+          <w:sz w:val="32"/>
+          <w:szCs w:val="32"/>
+          <w:highlight w:val="green"/>
+          <w:u w:val="none"/>
+          <w:lang w:val="en-GB"/>
+        </w:rPr>
+        <w:t xml:space="preserve"> </w:t>
+      </w:r>
+      <w:r>
+        <w:rPr>
+          <w:rFonts w:ascii="Aptos" w:hAnsi="Aptos" w:eastAsia="Aptos" w:cs="Aptos" w:asciiTheme="minorAscii" w:hAnsiTheme="minorAscii" w:eastAsiaTheme="minorAscii" w:cstheme="minorAscii"/>
+          <w:b w:val="1"/>
+          <w:bCs w:val="1"/>
+          <w:noProof w:val="0"/>
+          <w:sz w:val="32"/>
+          <w:szCs w:val="32"/>
+          <w:highlight w:val="green"/>
+          <w:u w:val="none"/>
+          <w:lang w:val="en-GB"/>
+        </w:rPr>
+        <w:t xml:space="preserve"> </w:t>
+      </w:r>
+      <w:r>
+        <w:rPr>
+          <w:rFonts w:ascii="Aptos" w:hAnsi="Aptos" w:eastAsia="Aptos" w:cs="Aptos" w:asciiTheme="minorAscii" w:hAnsiTheme="minorAscii" w:eastAsiaTheme="minorAscii" w:cstheme="minorAscii"/>
+          <w:b w:val="1"/>
+          <w:bCs w:val="1"/>
+          <w:noProof w:val="0"/>
+          <w:sz w:val="32"/>
+          <w:szCs w:val="32"/>
+          <w:highlight w:val="green"/>
+          <w:u w:val="none"/>
+          <w:lang w:val="en-GB"/>
+        </w:rPr>
+        <w:t>A</w:t>
+      </w:r>
+      <w:r>
+        <w:rPr>
+          <w:rFonts w:ascii="Aptos" w:hAnsi="Aptos" w:eastAsia="Aptos" w:cs="Aptos" w:asciiTheme="minorAscii" w:hAnsiTheme="minorAscii" w:eastAsiaTheme="minorAscii" w:cstheme="minorAscii"/>
+          <w:b w:val="1"/>
+          <w:bCs w:val="1"/>
+          <w:noProof w:val="0"/>
+          <w:sz w:val="32"/>
+          <w:szCs w:val="32"/>
+          <w:highlight w:val="green"/>
+          <w:u w:val="none"/>
+          <w:lang w:val="en-GB"/>
+        </w:rPr>
+        <w:t xml:space="preserve"> </w:t>
+      </w:r>
+      <w:r>
+        <w:rPr>
+          <w:rFonts w:ascii="Aptos" w:hAnsi="Aptos" w:eastAsia="Aptos" w:cs="Aptos" w:asciiTheme="minorAscii" w:hAnsiTheme="minorAscii" w:eastAsiaTheme="minorAscii" w:cstheme="minorAscii"/>
+          <w:b w:val="1"/>
+          <w:bCs w:val="1"/>
+          <w:noProof w:val="0"/>
+          <w:sz w:val="32"/>
+          <w:szCs w:val="32"/>
+          <w:highlight w:val="green"/>
+          <w:u w:val="none"/>
+          <w:lang w:val="en-GB"/>
+        </w:rPr>
+        <w:t>C</w:t>
+      </w:r>
+      <w:r>
+        <w:rPr>
+          <w:rFonts w:ascii="Aptos" w:hAnsi="Aptos" w:eastAsia="Aptos" w:cs="Aptos" w:asciiTheme="minorAscii" w:hAnsiTheme="minorAscii" w:eastAsiaTheme="minorAscii" w:cstheme="minorAscii"/>
+          <w:b w:val="1"/>
+          <w:bCs w:val="1"/>
+          <w:noProof w:val="0"/>
+          <w:sz w:val="32"/>
+          <w:szCs w:val="32"/>
+          <w:highlight w:val="green"/>
+          <w:u w:val="none"/>
+          <w:lang w:val="en-GB"/>
+        </w:rPr>
+        <w:t xml:space="preserve"> </w:t>
+      </w:r>
+      <w:r>
+        <w:rPr>
+          <w:rFonts w:ascii="Aptos" w:hAnsi="Aptos" w:eastAsia="Aptos" w:cs="Aptos" w:asciiTheme="minorAscii" w:hAnsiTheme="minorAscii" w:eastAsiaTheme="minorAscii" w:cstheme="minorAscii"/>
+          <w:b w:val="1"/>
+          <w:bCs w:val="1"/>
+          <w:noProof w:val="0"/>
+          <w:sz w:val="32"/>
+          <w:szCs w:val="32"/>
+          <w:highlight w:val="green"/>
+          <w:u w:val="none"/>
+          <w:lang w:val="en-GB"/>
+        </w:rPr>
+        <w:t>A</w:t>
+      </w:r>
+      <w:r>
+        <w:rPr>
+          <w:rFonts w:ascii="Aptos" w:hAnsi="Aptos" w:eastAsia="Aptos" w:cs="Aptos" w:asciiTheme="minorAscii" w:hAnsiTheme="minorAscii" w:eastAsiaTheme="minorAscii" w:cstheme="minorAscii"/>
+          <w:b w:val="1"/>
+          <w:bCs w:val="1"/>
+          <w:noProof w:val="0"/>
+          <w:sz w:val="32"/>
+          <w:szCs w:val="32"/>
+          <w:highlight w:val="green"/>
+          <w:u w:val="none"/>
+          <w:lang w:val="en-GB"/>
+        </w:rPr>
+        <w:t xml:space="preserve"> – </w:t>
+      </w:r>
+      <w:r>
+        <w:rPr>
+          <w:rFonts w:ascii="Aptos" w:hAnsi="Aptos" w:eastAsia="Aptos" w:cs="Aptos" w:asciiTheme="minorAscii" w:hAnsiTheme="minorAscii" w:eastAsiaTheme="minorAscii" w:cstheme="minorAscii"/>
+          <w:b w:val="1"/>
+          <w:bCs w:val="1"/>
+          <w:noProof w:val="0"/>
+          <w:sz w:val="32"/>
+          <w:szCs w:val="32"/>
+          <w:highlight w:val="green"/>
+          <w:u w:val="none"/>
+          <w:lang w:val="en-GB"/>
+        </w:rPr>
+        <w:t xml:space="preserve"> </w:t>
+      </w:r>
+      <w:r>
+        <w:rPr>
+          <w:rFonts w:ascii="Aptos" w:hAnsi="Aptos" w:eastAsia="Aptos" w:cs="Aptos" w:asciiTheme="minorAscii" w:hAnsiTheme="minorAscii" w:eastAsiaTheme="minorAscii" w:cstheme="minorAscii"/>
+          <w:b w:val="1"/>
+          <w:bCs w:val="1"/>
+          <w:noProof w:val="0"/>
+          <w:sz w:val="32"/>
+          <w:szCs w:val="32"/>
+          <w:highlight w:val="green"/>
+          <w:u w:val="none"/>
+          <w:lang w:val="en-GB"/>
+        </w:rPr>
+        <w:t>C</w:t>
+      </w:r>
+      <w:r>
+        <w:rPr>
+          <w:rFonts w:ascii="Aptos" w:hAnsi="Aptos" w:eastAsia="Aptos" w:cs="Aptos" w:asciiTheme="minorAscii" w:hAnsiTheme="minorAscii" w:eastAsiaTheme="minorAscii" w:cstheme="minorAscii"/>
+          <w:b w:val="1"/>
+          <w:bCs w:val="1"/>
+          <w:noProof w:val="0"/>
+          <w:sz w:val="32"/>
+          <w:szCs w:val="32"/>
+          <w:highlight w:val="green"/>
+          <w:u w:val="none"/>
+          <w:lang w:val="en-GB"/>
+        </w:rPr>
+        <w:t xml:space="preserve"> </w:t>
+      </w:r>
+      <w:r>
+        <w:rPr>
+          <w:rFonts w:ascii="Aptos" w:hAnsi="Aptos" w:eastAsia="Aptos" w:cs="Aptos" w:asciiTheme="minorAscii" w:hAnsiTheme="minorAscii" w:eastAsiaTheme="minorAscii" w:cstheme="minorAscii"/>
+          <w:b w:val="1"/>
+          <w:bCs w:val="1"/>
+          <w:noProof w:val="0"/>
+          <w:sz w:val="32"/>
+          <w:szCs w:val="32"/>
+          <w:highlight w:val="green"/>
+          <w:u w:val="none"/>
+          <w:lang w:val="en-GB"/>
+        </w:rPr>
+        <w:t>G</w:t>
+      </w:r>
+      <w:r>
+        <w:rPr>
+          <w:rFonts w:ascii="Aptos" w:hAnsi="Aptos" w:eastAsia="Aptos" w:cs="Aptos" w:asciiTheme="minorAscii" w:hAnsiTheme="minorAscii" w:eastAsiaTheme="minorAscii" w:cstheme="minorAscii"/>
+          <w:b w:val="1"/>
+          <w:bCs w:val="1"/>
+          <w:noProof w:val="0"/>
+          <w:sz w:val="32"/>
+          <w:szCs w:val="32"/>
+          <w:highlight w:val="green"/>
+          <w:u w:val="none"/>
+          <w:lang w:val="en-GB"/>
+        </w:rPr>
+        <w:t xml:space="preserve"> </w:t>
+      </w:r>
+      <w:r>
+        <w:rPr>
+          <w:rFonts w:ascii="Aptos" w:hAnsi="Aptos" w:eastAsia="Aptos" w:cs="Aptos" w:asciiTheme="minorAscii" w:hAnsiTheme="minorAscii" w:eastAsiaTheme="minorAscii" w:cstheme="minorAscii"/>
+          <w:b w:val="1"/>
+          <w:bCs w:val="1"/>
+          <w:noProof w:val="0"/>
+          <w:sz w:val="32"/>
+          <w:szCs w:val="32"/>
+          <w:highlight w:val="green"/>
+          <w:u w:val="none"/>
+          <w:lang w:val="en-GB"/>
+        </w:rPr>
+        <w:t xml:space="preserve"> </w:t>
+      </w:r>
+      <w:r>
+        <w:rPr>
+          <w:rFonts w:ascii="Aptos" w:hAnsi="Aptos" w:eastAsia="Aptos" w:cs="Aptos" w:asciiTheme="minorAscii" w:hAnsiTheme="minorAscii" w:eastAsiaTheme="minorAscii" w:cstheme="minorAscii"/>
+          <w:b w:val="1"/>
+          <w:bCs w:val="1"/>
+          <w:noProof w:val="0"/>
+          <w:sz w:val="32"/>
+          <w:szCs w:val="32"/>
+          <w:highlight w:val="green"/>
+          <w:u w:val="none"/>
+          <w:lang w:val="en-GB"/>
+        </w:rPr>
+        <w:t>-</w:t>
+      </w:r>
+      <w:r>
+        <w:br/>
+      </w:r>
+      <w:r>
+        <w:rPr>
+          <w:rFonts w:ascii="Aptos" w:hAnsi="Aptos" w:eastAsia="Aptos" w:cs="Aptos" w:asciiTheme="minorAscii" w:hAnsiTheme="minorAscii" w:eastAsiaTheme="minorAscii" w:cstheme="minorAscii"/>
+          <w:b w:val="1"/>
+          <w:bCs w:val="1"/>
+          <w:noProof w:val="0"/>
+          <w:sz w:val="32"/>
+          <w:szCs w:val="32"/>
+          <w:highlight w:val="green"/>
+          <w:u w:val="none"/>
+          <w:lang w:val="en-GB"/>
+        </w:rPr>
+        <w:t>-</w:t>
+      </w:r>
+      <w:r>
+        <w:rPr>
+          <w:rFonts w:ascii="Aptos" w:hAnsi="Aptos" w:eastAsia="Aptos" w:cs="Aptos" w:asciiTheme="minorAscii" w:hAnsiTheme="minorAscii" w:eastAsiaTheme="minorAscii" w:cstheme="minorAscii"/>
+          <w:b w:val="1"/>
+          <w:bCs w:val="1"/>
+          <w:noProof w:val="0"/>
+          <w:sz w:val="32"/>
+          <w:szCs w:val="32"/>
+          <w:highlight w:val="green"/>
+          <w:u w:val="none"/>
+          <w:lang w:val="en-GB"/>
+        </w:rPr>
+        <w:t xml:space="preserve"> </w:t>
+      </w:r>
+      <w:r>
+        <w:rPr>
+          <w:rFonts w:ascii="Aptos" w:hAnsi="Aptos" w:eastAsia="Aptos" w:cs="Aptos" w:asciiTheme="minorAscii" w:hAnsiTheme="minorAscii" w:eastAsiaTheme="minorAscii" w:cstheme="minorAscii"/>
+          <w:b w:val="1"/>
+          <w:bCs w:val="1"/>
+          <w:noProof w:val="0"/>
+          <w:sz w:val="32"/>
+          <w:szCs w:val="32"/>
+          <w:highlight w:val="green"/>
+          <w:u w:val="none"/>
+          <w:lang w:val="en-GB"/>
+        </w:rPr>
+        <w:t xml:space="preserve"> </w:t>
+      </w:r>
+      <w:r>
+        <w:rPr>
+          <w:rFonts w:ascii="Aptos" w:hAnsi="Aptos" w:eastAsia="Aptos" w:cs="Aptos" w:asciiTheme="minorAscii" w:hAnsiTheme="minorAscii" w:eastAsiaTheme="minorAscii" w:cstheme="minorAscii"/>
+          <w:b w:val="1"/>
+          <w:bCs w:val="1"/>
+          <w:noProof w:val="0"/>
+          <w:sz w:val="32"/>
+          <w:szCs w:val="32"/>
+          <w:highlight w:val="green"/>
+          <w:u w:val="none"/>
+          <w:lang w:val="en-GB"/>
+        </w:rPr>
+        <w:t>-</w:t>
+      </w:r>
+      <w:r>
+        <w:rPr>
+          <w:rFonts w:ascii="Aptos" w:hAnsi="Aptos" w:eastAsia="Aptos" w:cs="Aptos" w:asciiTheme="minorAscii" w:hAnsiTheme="minorAscii" w:eastAsiaTheme="minorAscii" w:cstheme="minorAscii"/>
+          <w:b w:val="1"/>
+          <w:bCs w:val="1"/>
+          <w:noProof w:val="0"/>
+          <w:sz w:val="32"/>
+          <w:szCs w:val="32"/>
+          <w:highlight w:val="green"/>
+          <w:u w:val="none"/>
+          <w:lang w:val="en-GB"/>
+        </w:rPr>
+        <w:t xml:space="preserve"> </w:t>
+      </w:r>
+      <w:r>
+        <w:rPr>
+          <w:rFonts w:ascii="Aptos" w:hAnsi="Aptos" w:eastAsia="Aptos" w:cs="Aptos" w:asciiTheme="minorAscii" w:hAnsiTheme="minorAscii" w:eastAsiaTheme="minorAscii" w:cstheme="minorAscii"/>
+          <w:b w:val="1"/>
+          <w:bCs w:val="1"/>
+          <w:noProof w:val="0"/>
+          <w:sz w:val="32"/>
+          <w:szCs w:val="32"/>
+          <w:highlight w:val="green"/>
+          <w:u w:val="none"/>
+          <w:lang w:val="en-GB"/>
+        </w:rPr>
+        <w:t xml:space="preserve"> </w:t>
+      </w:r>
+      <w:r>
+        <w:rPr>
+          <w:rFonts w:ascii="Aptos" w:hAnsi="Aptos" w:eastAsia="Aptos" w:cs="Aptos" w:asciiTheme="minorAscii" w:hAnsiTheme="minorAscii" w:eastAsiaTheme="minorAscii" w:cstheme="minorAscii"/>
+          <w:b w:val="1"/>
+          <w:bCs w:val="1"/>
+          <w:noProof w:val="0"/>
+          <w:sz w:val="32"/>
+          <w:szCs w:val="32"/>
+          <w:highlight w:val="green"/>
+          <w:u w:val="none"/>
+          <w:lang w:val="en-GB"/>
+        </w:rPr>
+        <w:t>C</w:t>
+      </w:r>
+      <w:r>
+        <w:rPr>
+          <w:rFonts w:ascii="Aptos" w:hAnsi="Aptos" w:eastAsia="Aptos" w:cs="Aptos" w:asciiTheme="minorAscii" w:hAnsiTheme="minorAscii" w:eastAsiaTheme="minorAscii" w:cstheme="minorAscii"/>
+          <w:b w:val="1"/>
+          <w:bCs w:val="1"/>
+          <w:noProof w:val="0"/>
+          <w:sz w:val="32"/>
+          <w:szCs w:val="32"/>
+          <w:highlight w:val="green"/>
+          <w:u w:val="none"/>
+          <w:lang w:val="en-GB"/>
+        </w:rPr>
+        <w:t xml:space="preserve"> </w:t>
+      </w:r>
+      <w:r>
+        <w:rPr>
+          <w:rFonts w:ascii="Aptos" w:hAnsi="Aptos" w:eastAsia="Aptos" w:cs="Aptos" w:asciiTheme="minorAscii" w:hAnsiTheme="minorAscii" w:eastAsiaTheme="minorAscii" w:cstheme="minorAscii"/>
+          <w:b w:val="1"/>
+          <w:bCs w:val="1"/>
+          <w:noProof w:val="0"/>
+          <w:sz w:val="32"/>
+          <w:szCs w:val="32"/>
+          <w:highlight w:val="green"/>
+          <w:u w:val="none"/>
+          <w:lang w:val="en-GB"/>
+        </w:rPr>
+        <w:t>A</w:t>
+      </w:r>
+      <w:r>
+        <w:rPr>
+          <w:rFonts w:ascii="Aptos" w:hAnsi="Aptos" w:eastAsia="Aptos" w:cs="Aptos" w:asciiTheme="minorAscii" w:hAnsiTheme="minorAscii" w:eastAsiaTheme="minorAscii" w:cstheme="minorAscii"/>
+          <w:b w:val="1"/>
+          <w:bCs w:val="1"/>
+          <w:noProof w:val="0"/>
+          <w:sz w:val="32"/>
+          <w:szCs w:val="32"/>
+          <w:highlight w:val="green"/>
+          <w:u w:val="none"/>
+          <w:lang w:val="en-GB"/>
+        </w:rPr>
+        <w:t xml:space="preserve"> </w:t>
+      </w:r>
+      <w:r>
+        <w:rPr>
+          <w:rFonts w:ascii="Aptos" w:hAnsi="Aptos" w:eastAsia="Aptos" w:cs="Aptos" w:asciiTheme="minorAscii" w:hAnsiTheme="minorAscii" w:eastAsiaTheme="minorAscii" w:cstheme="minorAscii"/>
+          <w:b w:val="1"/>
+          <w:bCs w:val="1"/>
+          <w:noProof w:val="0"/>
+          <w:sz w:val="32"/>
+          <w:szCs w:val="32"/>
+          <w:highlight w:val="green"/>
+          <w:u w:val="none"/>
+          <w:lang w:val="en-GB"/>
+        </w:rPr>
+        <w:t>C</w:t>
+      </w:r>
+      <w:r>
+        <w:rPr>
+          <w:rFonts w:ascii="Aptos" w:hAnsi="Aptos" w:eastAsia="Aptos" w:cs="Aptos" w:asciiTheme="minorAscii" w:hAnsiTheme="minorAscii" w:eastAsiaTheme="minorAscii" w:cstheme="minorAscii"/>
+          <w:b w:val="1"/>
+          <w:bCs w:val="1"/>
+          <w:noProof w:val="0"/>
+          <w:sz w:val="32"/>
+          <w:szCs w:val="32"/>
+          <w:highlight w:val="green"/>
+          <w:u w:val="none"/>
+          <w:lang w:val="en-GB"/>
+        </w:rPr>
+        <w:t xml:space="preserve"> </w:t>
+      </w:r>
+      <w:r>
+        <w:rPr>
+          <w:rFonts w:ascii="Aptos" w:hAnsi="Aptos" w:eastAsia="Aptos" w:cs="Aptos" w:asciiTheme="minorAscii" w:hAnsiTheme="minorAscii" w:eastAsiaTheme="minorAscii" w:cstheme="minorAscii"/>
+          <w:b w:val="1"/>
+          <w:bCs w:val="1"/>
+          <w:noProof w:val="0"/>
+          <w:sz w:val="32"/>
+          <w:szCs w:val="32"/>
+          <w:highlight w:val="green"/>
+          <w:u w:val="none"/>
+          <w:lang w:val="en-GB"/>
+        </w:rPr>
+        <w:t>A</w:t>
+      </w:r>
+      <w:r>
+        <w:rPr>
+          <w:rFonts w:ascii="Aptos" w:hAnsi="Aptos" w:eastAsia="Aptos" w:cs="Aptos" w:asciiTheme="minorAscii" w:hAnsiTheme="minorAscii" w:eastAsiaTheme="minorAscii" w:cstheme="minorAscii"/>
+          <w:b w:val="1"/>
+          <w:bCs w:val="1"/>
+          <w:noProof w:val="0"/>
+          <w:sz w:val="32"/>
+          <w:szCs w:val="32"/>
+          <w:highlight w:val="green"/>
+          <w:u w:val="none"/>
+          <w:lang w:val="en-GB"/>
+        </w:rPr>
+        <w:t xml:space="preserve"> </w:t>
+      </w:r>
+      <w:r>
+        <w:rPr>
+          <w:rFonts w:ascii="Aptos" w:hAnsi="Aptos" w:eastAsia="Aptos" w:cs="Aptos" w:asciiTheme="minorAscii" w:hAnsiTheme="minorAscii" w:eastAsiaTheme="minorAscii" w:cstheme="minorAscii"/>
+          <w:b w:val="1"/>
+          <w:bCs w:val="1"/>
+          <w:noProof w:val="0"/>
+          <w:sz w:val="32"/>
+          <w:szCs w:val="32"/>
+          <w:highlight w:val="green"/>
+          <w:u w:val="none"/>
+          <w:lang w:val="en-GB"/>
+        </w:rPr>
+        <w:t>G</w:t>
+      </w:r>
+      <w:r>
+        <w:rPr>
+          <w:rFonts w:ascii="Aptos" w:hAnsi="Aptos" w:eastAsia="Aptos" w:cs="Aptos" w:asciiTheme="minorAscii" w:hAnsiTheme="minorAscii" w:eastAsiaTheme="minorAscii" w:cstheme="minorAscii"/>
+          <w:b w:val="1"/>
+          <w:bCs w:val="1"/>
+          <w:noProof w:val="0"/>
+          <w:sz w:val="32"/>
+          <w:szCs w:val="32"/>
+          <w:highlight w:val="green"/>
+          <w:u w:val="none"/>
+          <w:lang w:val="en-GB"/>
+        </w:rPr>
+        <w:t xml:space="preserve"> </w:t>
+      </w:r>
+      <w:r>
+        <w:rPr>
+          <w:rFonts w:ascii="Aptos" w:hAnsi="Aptos" w:eastAsia="Aptos" w:cs="Aptos" w:asciiTheme="minorAscii" w:hAnsiTheme="minorAscii" w:eastAsiaTheme="minorAscii" w:cstheme="minorAscii"/>
+          <w:b w:val="1"/>
+          <w:bCs w:val="1"/>
+          <w:noProof w:val="0"/>
+          <w:sz w:val="32"/>
+          <w:szCs w:val="32"/>
+          <w:highlight w:val="green"/>
+          <w:u w:val="none"/>
+          <w:lang w:val="en-GB"/>
+        </w:rPr>
+        <w:t>A</w:t>
+      </w:r>
+      <w:r>
+        <w:rPr>
+          <w:rFonts w:ascii="Aptos" w:hAnsi="Aptos" w:eastAsia="Aptos" w:cs="Aptos" w:asciiTheme="minorAscii" w:hAnsiTheme="minorAscii" w:eastAsiaTheme="minorAscii" w:cstheme="minorAscii"/>
+          <w:b w:val="1"/>
+          <w:bCs w:val="1"/>
+          <w:noProof w:val="0"/>
+          <w:sz w:val="32"/>
+          <w:szCs w:val="32"/>
+          <w:highlight w:val="green"/>
+          <w:u w:val="none"/>
+          <w:lang w:val="en-GB"/>
+        </w:rPr>
+        <w:t xml:space="preserve"> </w:t>
+      </w:r>
+      <w:r>
+        <w:rPr>
+          <w:rFonts w:ascii="Aptos" w:hAnsi="Aptos" w:eastAsia="Aptos" w:cs="Aptos" w:asciiTheme="minorAscii" w:hAnsiTheme="minorAscii" w:eastAsiaTheme="minorAscii" w:cstheme="minorAscii"/>
+          <w:b w:val="1"/>
+          <w:bCs w:val="1"/>
+          <w:noProof w:val="0"/>
+          <w:sz w:val="32"/>
+          <w:szCs w:val="32"/>
+          <w:highlight w:val="green"/>
+          <w:u w:val="none"/>
+          <w:lang w:val="en-GB"/>
+        </w:rPr>
+        <w:t>G</w:t>
+      </w:r>
+      <w:r>
+        <w:rPr>
+          <w:rFonts w:ascii="Aptos" w:hAnsi="Aptos" w:eastAsia="Aptos" w:cs="Aptos" w:asciiTheme="minorAscii" w:hAnsiTheme="minorAscii" w:eastAsiaTheme="minorAscii" w:cstheme="minorAscii"/>
+          <w:b w:val="1"/>
+          <w:bCs w:val="1"/>
+          <w:noProof w:val="0"/>
+          <w:sz w:val="32"/>
+          <w:szCs w:val="32"/>
+          <w:highlight w:val="green"/>
+          <w:u w:val="none"/>
+          <w:lang w:val="en-GB"/>
+        </w:rPr>
+        <w:t xml:space="preserve"> </w:t>
+      </w:r>
+      <w:r>
+        <w:rPr>
+          <w:rFonts w:ascii="Aptos" w:hAnsi="Aptos" w:eastAsia="Aptos" w:cs="Aptos" w:asciiTheme="minorAscii" w:hAnsiTheme="minorAscii" w:eastAsiaTheme="minorAscii" w:cstheme="minorAscii"/>
+          <w:b w:val="1"/>
+          <w:bCs w:val="1"/>
+          <w:noProof w:val="0"/>
+          <w:sz w:val="32"/>
+          <w:szCs w:val="32"/>
+          <w:highlight w:val="green"/>
+          <w:u w:val="none"/>
+          <w:lang w:val="en-GB"/>
+        </w:rPr>
+        <w:t>T</w:t>
       </w:r>
     </w:p>
     <w:p>
@@ -3854,6 +4726,46 @@
           <w:szCs w:val="20"/>
           <w:lang w:val="en-GB"/>
         </w:rPr>
+        <w:t xml:space="preserve">A dash </w:t>
+      </w:r>
+      <w:r>
+        <w:rPr>
+          <w:rFonts w:ascii="Aptos" w:hAnsi="Aptos" w:eastAsia="Aptos" w:cs="Aptos"/>
+          <w:noProof w:val="0"/>
+          <w:sz w:val="20"/>
+          <w:szCs w:val="20"/>
+          <w:lang w:val="en-GB"/>
+        </w:rPr>
+        <w:t>represents</w:t>
+      </w:r>
+      <w:r>
+        <w:rPr>
+          <w:rFonts w:ascii="Aptos" w:hAnsi="Aptos" w:eastAsia="Aptos" w:cs="Aptos"/>
+          <w:noProof w:val="0"/>
+          <w:sz w:val="20"/>
+          <w:szCs w:val="20"/>
+          <w:lang w:val="en-GB"/>
+        </w:rPr>
+        <w:t xml:space="preserve"> a gap therefore removing the gaps gives the two original sequences.</w:t>
+      </w:r>
+      <w:r>
+        <w:rPr>
+          <w:rFonts w:ascii="Aptos" w:hAnsi="Aptos" w:eastAsia="Aptos" w:cs="Aptos"/>
+          <w:noProof w:val="0"/>
+          <w:sz w:val="20"/>
+          <w:szCs w:val="20"/>
+          <w:lang w:val="en-GB"/>
+        </w:rPr>
+        <w:t xml:space="preserve"> </w:t>
+      </w:r>
+      <w:r>
+        <w:rPr>
+          <w:rFonts w:ascii="Aptos" w:hAnsi="Aptos" w:eastAsia="Aptos" w:cs="Aptos"/>
+          <w:noProof w:val="0"/>
+          <w:sz w:val="20"/>
+          <w:szCs w:val="20"/>
+          <w:lang w:val="en-GB"/>
+        </w:rPr>
         <w:t>As you can see there are 4 matches, 2 mismatches and 4 gaps which produces a total score of –</w:t>
       </w:r>
       <w:r>
@@ -3915,6 +4827,75 @@
           <w:lang w:val="en-GB"/>
         </w:rPr>
         <w:t>.</w:t>
+      </w:r>
+    </w:p>
+    <w:p>
+      <w:pPr>
+        <w:pStyle w:val="Normal"/>
+        <w:suppressLineNumbers w:val="0"/>
+        <w:spacing w:before="240" w:beforeAutospacing="off" w:after="240" w:afterAutospacing="off" w:line="279" w:lineRule="auto"/>
+        <w:ind w:left="0" w:right="0"/>
+        <w:jc w:val="left"/>
+      </w:pPr>
+      <w:r>
+        <w:rPr>
+          <w:rFonts w:ascii="Aptos" w:hAnsi="Aptos" w:eastAsia="Aptos" w:cs="Aptos"/>
+          <w:noProof w:val="0"/>
+          <w:sz w:val="20"/>
+          <w:szCs w:val="20"/>
+          <w:lang w:val="en-GB"/>
+        </w:rPr>
+        <w:t xml:space="preserve">This matches the bottom-right score in the matrix, so this shows that the </w:t>
+      </w:r>
+      <w:r>
+        <w:rPr>
+          <w:rFonts w:ascii="Aptos" w:hAnsi="Aptos" w:eastAsia="Aptos" w:cs="Aptos"/>
+          <w:noProof w:val="0"/>
+          <w:sz w:val="20"/>
+          <w:szCs w:val="20"/>
+          <w:lang w:val="en-GB"/>
+        </w:rPr>
+        <w:t>alignment</w:t>
+      </w:r>
+      <w:r>
+        <w:rPr>
+          <w:rFonts w:ascii="Aptos" w:hAnsi="Aptos" w:eastAsia="Aptos" w:cs="Aptos"/>
+          <w:noProof w:val="0"/>
+          <w:sz w:val="20"/>
+          <w:szCs w:val="20"/>
+          <w:lang w:val="en-GB"/>
+        </w:rPr>
+        <w:t xml:space="preserve"> is </w:t>
+      </w:r>
+      <w:r>
+        <w:rPr>
+          <w:rFonts w:ascii="Aptos" w:hAnsi="Aptos" w:eastAsia="Aptos" w:cs="Aptos"/>
+          <w:noProof w:val="0"/>
+          <w:sz w:val="20"/>
+          <w:szCs w:val="20"/>
+          <w:lang w:val="en-GB"/>
+        </w:rPr>
+        <w:t>optimal</w:t>
+      </w:r>
+      <w:r>
+        <w:rPr>
+          <w:rFonts w:ascii="Aptos" w:hAnsi="Aptos" w:eastAsia="Aptos" w:cs="Aptos"/>
+          <w:noProof w:val="0"/>
+          <w:sz w:val="20"/>
+          <w:szCs w:val="20"/>
+          <w:lang w:val="en-GB"/>
+        </w:rPr>
+        <w:t>.</w:t>
+      </w:r>
+      <w:r>
+        <w:rPr>
+          <w:rFonts w:ascii="Aptos" w:hAnsi="Aptos" w:eastAsia="Aptos" w:cs="Aptos"/>
+          <w:noProof w:val="0"/>
+          <w:sz w:val="20"/>
+          <w:szCs w:val="20"/>
+          <w:lang w:val="en-GB"/>
+        </w:rPr>
+        <w:t xml:space="preserve"> </w:t>
       </w:r>
     </w:p>
     <w:p>
@@ -3925,13 +4906,6 @@
         <w:spacing w:before="240" w:beforeAutospacing="off" w:after="240" w:afterAutospacing="off" w:line="279" w:lineRule="auto"/>
         <w:ind w:left="0" w:right="0"/>
         <w:jc w:val="left"/>
-        <w:rPr>
-          <w:rFonts w:ascii="Aptos" w:hAnsi="Aptos" w:eastAsia="Aptos" w:cs="Aptos"/>
-          <w:noProof w:val="0"/>
-          <w:sz w:val="20"/>
-          <w:szCs w:val="20"/>
-          <w:lang w:val="en-GB"/>
-        </w:rPr>
       </w:pPr>
       <w:r>
         <w:rPr>
@@ -3941,47 +4915,7 @@
           <w:szCs w:val="20"/>
           <w:lang w:val="en-GB"/>
         </w:rPr>
-        <w:t xml:space="preserve">This matches the bottom-right score in the matrix, so this shows that the </w:t>
-      </w:r>
-      <w:r>
-        <w:rPr>
-          <w:rFonts w:ascii="Aptos" w:hAnsi="Aptos" w:eastAsia="Aptos" w:cs="Aptos"/>
-          <w:noProof w:val="0"/>
-          <w:sz w:val="20"/>
-          <w:szCs w:val="20"/>
-          <w:lang w:val="en-GB"/>
-        </w:rPr>
-        <w:t>alignment</w:t>
-      </w:r>
-      <w:r>
-        <w:rPr>
-          <w:rFonts w:ascii="Aptos" w:hAnsi="Aptos" w:eastAsia="Aptos" w:cs="Aptos"/>
-          <w:noProof w:val="0"/>
-          <w:sz w:val="20"/>
-          <w:szCs w:val="20"/>
-          <w:lang w:val="en-GB"/>
-        </w:rPr>
-        <w:t xml:space="preserve"> is </w:t>
-      </w:r>
-      <w:r>
-        <w:rPr>
-          <w:rFonts w:ascii="Aptos" w:hAnsi="Aptos" w:eastAsia="Aptos" w:cs="Aptos"/>
-          <w:noProof w:val="0"/>
-          <w:sz w:val="20"/>
-          <w:szCs w:val="20"/>
-          <w:lang w:val="en-GB"/>
-        </w:rPr>
-        <w:t>optimal.</w:t>
-      </w:r>
-      <w:r>
-        <w:rPr>
-          <w:rFonts w:ascii="Aptos" w:hAnsi="Aptos" w:eastAsia="Aptos" w:cs="Aptos"/>
-          <w:noProof w:val="0"/>
-          <w:sz w:val="20"/>
-          <w:szCs w:val="20"/>
-          <w:lang w:val="en-GB"/>
-        </w:rPr>
-        <w:t xml:space="preserve"> However that being said, </w:t>
+        <w:t xml:space="preserve">However that being said, </w:t>
       </w:r>
       <w:r>
         <w:rPr>
@@ -4042,6 +4976,358 @@
           <w:lang w:val="en-GB"/>
         </w:rPr>
         <w:t xml:space="preserve"> alignments with the same score.</w:t>
+      </w:r>
+      <w:r>
+        <w:rPr>
+          <w:rFonts w:ascii="Aptos" w:hAnsi="Aptos" w:eastAsia="Aptos" w:cs="Aptos"/>
+          <w:noProof w:val="0"/>
+          <w:sz w:val="20"/>
+          <w:szCs w:val="20"/>
+          <w:lang w:val="en-GB"/>
+        </w:rPr>
+        <w:t xml:space="preserve"> </w:t>
+      </w:r>
+      <w:r>
+        <w:rPr>
+          <w:rFonts w:ascii="Aptos" w:hAnsi="Aptos" w:eastAsia="Aptos" w:cs="Aptos"/>
+          <w:noProof w:val="0"/>
+          <w:sz w:val="20"/>
+          <w:szCs w:val="20"/>
+          <w:lang w:val="en-GB"/>
+        </w:rPr>
+        <w:t xml:space="preserve">For </w:t>
+      </w:r>
+      <w:r>
+        <w:rPr>
+          <w:rFonts w:ascii="Aptos" w:hAnsi="Aptos" w:eastAsia="Aptos" w:cs="Aptos"/>
+          <w:noProof w:val="0"/>
+          <w:sz w:val="20"/>
+          <w:szCs w:val="20"/>
+          <w:lang w:val="en-GB"/>
+        </w:rPr>
+        <w:t>example,</w:t>
+      </w:r>
+      <w:r>
+        <w:rPr>
+          <w:rFonts w:ascii="Aptos" w:hAnsi="Aptos" w:eastAsia="Aptos" w:cs="Aptos"/>
+          <w:noProof w:val="0"/>
+          <w:sz w:val="20"/>
+          <w:szCs w:val="20"/>
+          <w:lang w:val="en-GB"/>
+        </w:rPr>
+        <w:t xml:space="preserve"> when</w:t>
+      </w:r>
+      <w:r>
+        <w:rPr>
+          <w:rFonts w:ascii="Aptos" w:hAnsi="Aptos" w:eastAsia="Aptos" w:cs="Aptos"/>
+          <w:noProof w:val="0"/>
+          <w:sz w:val="20"/>
+          <w:szCs w:val="20"/>
+          <w:lang w:val="en-GB"/>
+        </w:rPr>
+        <w:t xml:space="preserve"> exploring </w:t>
+      </w:r>
+      <w:r>
+        <w:rPr>
+          <w:rFonts w:ascii="Aptos" w:hAnsi="Aptos" w:eastAsia="Aptos" w:cs="Aptos"/>
+          <w:noProof w:val="0"/>
+          <w:sz w:val="20"/>
+          <w:szCs w:val="20"/>
+          <w:lang w:val="en-GB"/>
+        </w:rPr>
+        <w:t>a substitution penalty of −3, with a gap penalty of −1 and a match score of +1</w:t>
+      </w:r>
+      <w:r>
+        <w:rPr>
+          <w:rFonts w:ascii="Aptos" w:hAnsi="Aptos" w:eastAsia="Aptos" w:cs="Aptos"/>
+          <w:noProof w:val="0"/>
+          <w:sz w:val="20"/>
+          <w:szCs w:val="20"/>
+          <w:lang w:val="en-GB"/>
+        </w:rPr>
+        <w:t xml:space="preserve"> you would get the following alignment :</w:t>
+      </w:r>
+    </w:p>
+    <w:p>
+      <w:pPr>
+        <w:pStyle w:val="Normal"/>
+        <w:bidi w:val="0"/>
+        <w:spacing w:before="240" w:beforeAutospacing="off" w:after="240" w:afterAutospacing="off" w:line="279" w:lineRule="auto"/>
+        <w:ind w:left="0" w:right="0"/>
+        <w:jc w:val="left"/>
+        <w:rPr>
+          <w:rFonts w:ascii="Aptos" w:hAnsi="Aptos" w:eastAsia="Aptos" w:cs="Aptos" w:asciiTheme="minorAscii" w:hAnsiTheme="minorAscii" w:eastAsiaTheme="minorAscii" w:cstheme="minorAscii"/>
+          <w:b w:val="1"/>
+          <w:bCs w:val="1"/>
+          <w:noProof w:val="0"/>
+          <w:sz w:val="32"/>
+          <w:szCs w:val="32"/>
+          <w:highlight w:val="green"/>
+          <w:lang w:val="en-GB"/>
+        </w:rPr>
+      </w:pPr>
+      <w:r>
+        <w:rPr>
+          <w:rFonts w:ascii="Aptos" w:hAnsi="Aptos" w:eastAsia="Aptos" w:cs="Aptos" w:asciiTheme="minorAscii" w:hAnsiTheme="minorAscii" w:eastAsiaTheme="minorAscii" w:cstheme="minorAscii"/>
+          <w:b w:val="1"/>
+          <w:bCs w:val="1"/>
+          <w:noProof w:val="0"/>
+          <w:sz w:val="32"/>
+          <w:szCs w:val="32"/>
+          <w:highlight w:val="green"/>
+          <w:lang w:val="en-GB"/>
+        </w:rPr>
+        <w:t xml:space="preserve">A T </w:t>
+      </w:r>
+      <w:r>
+        <w:rPr>
+          <w:rFonts w:ascii="Aptos" w:hAnsi="Aptos" w:eastAsia="Aptos" w:cs="Aptos" w:asciiTheme="minorAscii" w:hAnsiTheme="minorAscii" w:eastAsiaTheme="minorAscii" w:cstheme="minorAscii"/>
+          <w:b w:val="1"/>
+          <w:bCs w:val="1"/>
+          <w:noProof w:val="0"/>
+          <w:sz w:val="32"/>
+          <w:szCs w:val="32"/>
+          <w:highlight w:val="green"/>
+          <w:lang w:val="en-GB"/>
+        </w:rPr>
+        <w:t>T</w:t>
+      </w:r>
+      <w:r>
+        <w:rPr>
+          <w:rFonts w:ascii="Aptos" w:hAnsi="Aptos" w:eastAsia="Aptos" w:cs="Aptos" w:asciiTheme="minorAscii" w:hAnsiTheme="minorAscii" w:eastAsiaTheme="minorAscii" w:cstheme="minorAscii"/>
+          <w:b w:val="1"/>
+          <w:bCs w:val="1"/>
+          <w:noProof w:val="0"/>
+          <w:sz w:val="32"/>
+          <w:szCs w:val="32"/>
+          <w:highlight w:val="green"/>
+          <w:lang w:val="en-GB"/>
+        </w:rPr>
+        <w:t xml:space="preserve"> A C A C </w:t>
+      </w:r>
+      <w:r>
+        <w:rPr>
+          <w:rFonts w:ascii="Aptos" w:hAnsi="Aptos" w:eastAsia="Aptos" w:cs="Aptos" w:asciiTheme="minorAscii" w:hAnsiTheme="minorAscii" w:eastAsiaTheme="minorAscii" w:cstheme="minorAscii"/>
+          <w:b w:val="1"/>
+          <w:bCs w:val="1"/>
+          <w:noProof w:val="0"/>
+          <w:sz w:val="32"/>
+          <w:szCs w:val="32"/>
+          <w:highlight w:val="green"/>
+          <w:lang w:val="en-GB"/>
+        </w:rPr>
+        <w:t xml:space="preserve">- </w:t>
+      </w:r>
+      <w:r>
+        <w:rPr>
+          <w:rFonts w:ascii="Aptos" w:hAnsi="Aptos" w:eastAsia="Aptos" w:cs="Aptos" w:asciiTheme="minorAscii" w:hAnsiTheme="minorAscii" w:eastAsiaTheme="minorAscii" w:cstheme="minorAscii"/>
+          <w:b w:val="1"/>
+          <w:bCs w:val="1"/>
+          <w:noProof w:val="0"/>
+          <w:sz w:val="32"/>
+          <w:szCs w:val="32"/>
+          <w:highlight w:val="green"/>
+          <w:lang w:val="en-GB"/>
+        </w:rPr>
+        <w:t xml:space="preserve"> </w:t>
+      </w:r>
+      <w:r>
+        <w:rPr>
+          <w:rFonts w:ascii="Aptos" w:hAnsi="Aptos" w:eastAsia="Aptos" w:cs="Aptos" w:asciiTheme="minorAscii" w:hAnsiTheme="minorAscii" w:eastAsiaTheme="minorAscii" w:cstheme="minorAscii"/>
+          <w:b w:val="1"/>
+          <w:bCs w:val="1"/>
+          <w:noProof w:val="0"/>
+          <w:sz w:val="32"/>
+          <w:szCs w:val="32"/>
+          <w:highlight w:val="green"/>
+          <w:lang w:val="en-GB"/>
+        </w:rPr>
+        <w:t>-</w:t>
+      </w:r>
+      <w:r>
+        <w:rPr>
+          <w:rFonts w:ascii="Aptos" w:hAnsi="Aptos" w:eastAsia="Aptos" w:cs="Aptos" w:asciiTheme="minorAscii" w:hAnsiTheme="minorAscii" w:eastAsiaTheme="minorAscii" w:cstheme="minorAscii"/>
+          <w:b w:val="1"/>
+          <w:bCs w:val="1"/>
+          <w:noProof w:val="0"/>
+          <w:sz w:val="32"/>
+          <w:szCs w:val="32"/>
+          <w:highlight w:val="green"/>
+          <w:lang w:val="en-GB"/>
+        </w:rPr>
+        <w:t xml:space="preserve"> </w:t>
+      </w:r>
+      <w:r>
+        <w:rPr>
+          <w:rFonts w:ascii="Aptos" w:hAnsi="Aptos" w:eastAsia="Aptos" w:cs="Aptos" w:asciiTheme="minorAscii" w:hAnsiTheme="minorAscii" w:eastAsiaTheme="minorAscii" w:cstheme="minorAscii"/>
+          <w:b w:val="1"/>
+          <w:bCs w:val="1"/>
+          <w:noProof w:val="0"/>
+          <w:sz w:val="32"/>
+          <w:szCs w:val="32"/>
+          <w:highlight w:val="green"/>
+          <w:lang w:val="en-GB"/>
+        </w:rPr>
+        <w:t xml:space="preserve">  </w:t>
+      </w:r>
+      <w:r>
+        <w:rPr>
+          <w:rFonts w:ascii="Aptos" w:hAnsi="Aptos" w:eastAsia="Aptos" w:cs="Aptos" w:asciiTheme="minorAscii" w:hAnsiTheme="minorAscii" w:eastAsiaTheme="minorAscii" w:cstheme="minorAscii"/>
+          <w:b w:val="1"/>
+          <w:bCs w:val="1"/>
+          <w:noProof w:val="0"/>
+          <w:sz w:val="32"/>
+          <w:szCs w:val="32"/>
+          <w:highlight w:val="green"/>
+          <w:lang w:val="en-GB"/>
+        </w:rPr>
+        <w:t xml:space="preserve">- </w:t>
+      </w:r>
+      <w:r>
+        <w:rPr>
+          <w:rFonts w:ascii="Aptos" w:hAnsi="Aptos" w:eastAsia="Aptos" w:cs="Aptos" w:asciiTheme="minorAscii" w:hAnsiTheme="minorAscii" w:eastAsiaTheme="minorAscii" w:cstheme="minorAscii"/>
+          <w:b w:val="1"/>
+          <w:bCs w:val="1"/>
+          <w:noProof w:val="0"/>
+          <w:sz w:val="32"/>
+          <w:szCs w:val="32"/>
+          <w:highlight w:val="green"/>
+          <w:lang w:val="en-GB"/>
+        </w:rPr>
+        <w:t xml:space="preserve"> </w:t>
+      </w:r>
+      <w:r>
+        <w:rPr>
+          <w:rFonts w:ascii="Aptos" w:hAnsi="Aptos" w:eastAsia="Aptos" w:cs="Aptos" w:asciiTheme="minorAscii" w:hAnsiTheme="minorAscii" w:eastAsiaTheme="minorAscii" w:cstheme="minorAscii"/>
+          <w:b w:val="1"/>
+          <w:bCs w:val="1"/>
+          <w:noProof w:val="0"/>
+          <w:sz w:val="32"/>
+          <w:szCs w:val="32"/>
+          <w:highlight w:val="green"/>
+          <w:lang w:val="en-GB"/>
+        </w:rPr>
+        <w:t>G</w:t>
+      </w:r>
+      <w:r>
+        <w:rPr>
+          <w:rFonts w:ascii="Aptos" w:hAnsi="Aptos" w:eastAsia="Aptos" w:cs="Aptos" w:asciiTheme="minorAscii" w:hAnsiTheme="minorAscii" w:eastAsiaTheme="minorAscii" w:cstheme="minorAscii"/>
+          <w:b w:val="1"/>
+          <w:bCs w:val="1"/>
+          <w:noProof w:val="0"/>
+          <w:sz w:val="32"/>
+          <w:szCs w:val="32"/>
+          <w:highlight w:val="green"/>
+          <w:lang w:val="en-GB"/>
+        </w:rPr>
+        <w:t xml:space="preserve"> -</w:t>
+      </w:r>
+      <w:r>
+        <w:br/>
+      </w:r>
+      <w:r>
+        <w:rPr>
+          <w:rFonts w:ascii="Aptos" w:hAnsi="Aptos" w:eastAsia="Aptos" w:cs="Aptos" w:asciiTheme="minorAscii" w:hAnsiTheme="minorAscii" w:eastAsiaTheme="minorAscii" w:cstheme="minorAscii"/>
+          <w:b w:val="1"/>
+          <w:bCs w:val="1"/>
+          <w:noProof w:val="0"/>
+          <w:sz w:val="32"/>
+          <w:szCs w:val="32"/>
+          <w:highlight w:val="green"/>
+          <w:lang w:val="en-GB"/>
+        </w:rPr>
+        <w:t xml:space="preserve">- </w:t>
+      </w:r>
+      <w:r>
+        <w:rPr>
+          <w:rFonts w:ascii="Aptos" w:hAnsi="Aptos" w:eastAsia="Aptos" w:cs="Aptos" w:asciiTheme="minorAscii" w:hAnsiTheme="minorAscii" w:eastAsiaTheme="minorAscii" w:cstheme="minorAscii"/>
+          <w:b w:val="1"/>
+          <w:bCs w:val="1"/>
+          <w:noProof w:val="0"/>
+          <w:sz w:val="32"/>
+          <w:szCs w:val="32"/>
+          <w:highlight w:val="green"/>
+          <w:lang w:val="en-GB"/>
+        </w:rPr>
+        <w:t xml:space="preserve">  </w:t>
+      </w:r>
+      <w:r>
+        <w:rPr>
+          <w:rFonts w:ascii="Aptos" w:hAnsi="Aptos" w:eastAsia="Aptos" w:cs="Aptos" w:asciiTheme="minorAscii" w:hAnsiTheme="minorAscii" w:eastAsiaTheme="minorAscii" w:cstheme="minorAscii"/>
+          <w:b w:val="1"/>
+          <w:bCs w:val="1"/>
+          <w:noProof w:val="0"/>
+          <w:sz w:val="32"/>
+          <w:szCs w:val="32"/>
+          <w:highlight w:val="green"/>
+          <w:lang w:val="en-GB"/>
+        </w:rPr>
+        <w:t xml:space="preserve">- </w:t>
+      </w:r>
+      <w:r>
+        <w:rPr>
+          <w:rFonts w:ascii="Aptos" w:hAnsi="Aptos" w:eastAsia="Aptos" w:cs="Aptos" w:asciiTheme="minorAscii" w:hAnsiTheme="minorAscii" w:eastAsiaTheme="minorAscii" w:cstheme="minorAscii"/>
+          <w:b w:val="1"/>
+          <w:bCs w:val="1"/>
+          <w:noProof w:val="0"/>
+          <w:sz w:val="32"/>
+          <w:szCs w:val="32"/>
+          <w:highlight w:val="green"/>
+          <w:lang w:val="en-GB"/>
+        </w:rPr>
+        <w:t xml:space="preserve"> </w:t>
+      </w:r>
+      <w:r>
+        <w:rPr>
+          <w:rFonts w:ascii="Aptos" w:hAnsi="Aptos" w:eastAsia="Aptos" w:cs="Aptos" w:asciiTheme="minorAscii" w:hAnsiTheme="minorAscii" w:eastAsiaTheme="minorAscii" w:cstheme="minorAscii"/>
+          <w:b w:val="1"/>
+          <w:bCs w:val="1"/>
+          <w:noProof w:val="0"/>
+          <w:sz w:val="32"/>
+          <w:szCs w:val="32"/>
+          <w:highlight w:val="green"/>
+          <w:lang w:val="en-GB"/>
+        </w:rPr>
+        <w:t>-</w:t>
+      </w:r>
+      <w:r>
+        <w:rPr>
+          <w:rFonts w:ascii="Aptos" w:hAnsi="Aptos" w:eastAsia="Aptos" w:cs="Aptos" w:asciiTheme="minorAscii" w:hAnsiTheme="minorAscii" w:eastAsiaTheme="minorAscii" w:cstheme="minorAscii"/>
+          <w:b w:val="1"/>
+          <w:bCs w:val="1"/>
+          <w:noProof w:val="0"/>
+          <w:sz w:val="32"/>
+          <w:szCs w:val="32"/>
+          <w:highlight w:val="green"/>
+          <w:lang w:val="en-GB"/>
+        </w:rPr>
+        <w:t xml:space="preserve"> - </w:t>
+      </w:r>
+      <w:r>
+        <w:rPr>
+          <w:rFonts w:ascii="Aptos" w:hAnsi="Aptos" w:eastAsia="Aptos" w:cs="Aptos" w:asciiTheme="minorAscii" w:hAnsiTheme="minorAscii" w:eastAsiaTheme="minorAscii" w:cstheme="minorAscii"/>
+          <w:b w:val="1"/>
+          <w:bCs w:val="1"/>
+          <w:noProof w:val="0"/>
+          <w:sz w:val="32"/>
+          <w:szCs w:val="32"/>
+          <w:highlight w:val="green"/>
+          <w:lang w:val="en-GB"/>
+        </w:rPr>
+        <w:t xml:space="preserve"> </w:t>
+      </w:r>
+      <w:r>
+        <w:rPr>
+          <w:rFonts w:ascii="Aptos" w:hAnsi="Aptos" w:eastAsia="Aptos" w:cs="Aptos" w:asciiTheme="minorAscii" w:hAnsiTheme="minorAscii" w:eastAsiaTheme="minorAscii" w:cstheme="minorAscii"/>
+          <w:b w:val="1"/>
+          <w:bCs w:val="1"/>
+          <w:noProof w:val="0"/>
+          <w:sz w:val="32"/>
+          <w:szCs w:val="32"/>
+          <w:highlight w:val="green"/>
+          <w:lang w:val="en-GB"/>
+        </w:rPr>
+        <w:t>C A C A G A G T</w:t>
       </w:r>
     </w:p>
     <w:p>

</xml_diff>